<commit_message>
docs(report): update clean three-tier architecture diagram and fix docx formula rendering
</commit_message>
<xml_diff>
--- a/docs/reports/基于神经-符号双轨推理的惠购智能导购与售后争议治理系统_课程报告.docx
+++ b/docs/reports/基于神经-符号双轨推理的惠购智能导购与售后争议治理系统_课程报告.docx
@@ -13,7 +13,7 @@
           <w:b w:val="0"/>
           <w:i w:val="0"/>
           <w:color w:val="101828"/>
-          <w:sz w:val="40"/>
+          <w:sz w:val="36"/>
           <w:rFonts w:ascii="Times New Roman" w:hAnsi="Times New Roman" w:eastAsia="黑体"/>
         </w:rPr>
         <w:t>《人工智能》课程研究报告</w:t>
@@ -30,7 +30,7 @@
           <w:b w:val="0"/>
           <w:i w:val="0"/>
           <w:color w:val="101828"/>
-          <w:sz w:val="40"/>
+          <w:sz w:val="36"/>
           <w:rFonts w:ascii="Times New Roman" w:hAnsi="Times New Roman" w:eastAsia="黑体"/>
         </w:rPr>
         <w:t>基于神经-符号双轨推理的惠购智能导购与售后争议治理系统</w:t>
@@ -508,7 +508,7 @@
     </w:tbl>
     <w:p>
       <w:pPr>
-        <w:spacing w:after="120"/>
+        <w:spacing w:after="80"/>
       </w:pPr>
     </w:p>
     <w:p>
@@ -620,7 +620,29 @@
           <w:sz w:val="22"/>
           <w:rFonts w:ascii="Times New Roman" w:hAnsi="Times New Roman" w:eastAsia="宋体"/>
         </w:rPr>
-        <w:t>量化实验表明：在 80 至 40,000 条规则规模扩展实验中，启发式支持集剪枝在保证闭包等价的前提下将搜索空间压缩 89.9%，实现 3.90 倍加速；在证据冲突因子 $K=0.9999$ 的极端反欺诈测试中，传统 Dempster 规则产生 100% 误判归零，而 Murphy 修正算法将买家误判率有效纠正至 0.02%；双轨混合系统在合规拦截率（100%）、争议化解率（100%）、对抗欺诈识别率（100%）以及平均推理延迟（0.169 ms）等指标上全面优于单一符号推理与纯黑盒大模型，为工业级智能客服决策提供了兼具法定严肃度与人本温度的可落地范式。</w:t>
+        <w:t xml:space="preserve">量化实验表明：在 80 至 40,000 条规则规模扩展实验中，启发式支持集剪枝在保证闭包等价的前提下将搜索空间压缩 89.9%，实现 3.90 倍加速；在证据冲突因子 </w:t>
+      </w:r>
+      <w:r>
+        <w:rPr>
+          <w:rFonts w:ascii="Cambria Math" w:hAnsi="Cambria Math"/>
+          <w:b w:val="0"/>
+          <w:i/>
+          <w:color w:val="101828"/>
+          <w:sz w:val="22"/>
+          <w:rFonts w:ascii="Cambria Math" w:hAnsi="Cambria Math" w:eastAsia="Cambria Math"/>
+        </w:rPr>
+        <w:t>K=0.9999</w:t>
+      </w:r>
+      <w:r>
+        <w:rPr>
+          <w:rFonts w:ascii="Times New Roman" w:hAnsi="Times New Roman"/>
+          <w:b w:val="0"/>
+          <w:i w:val="0"/>
+          <w:color w:val="1D2939"/>
+          <w:sz w:val="22"/>
+          <w:rFonts w:ascii="Times New Roman" w:hAnsi="Times New Roman" w:eastAsia="宋体"/>
+        </w:rPr>
+        <w:t xml:space="preserve"> 的极端反欺诈测试中，传统 Dempster 规则产生 100% 误判归零，而 Murphy 修正算法将买家误判率有效纠正至 0.02%；双轨混合系统在合规拦截率（100%）、争议化解率（100%）、对抗欺诈识别率（100%）以及平均推理延迟（0.169 ms）等指标上全面优于单一符号推理与纯黑盒大模型，为工业级智能客服决策提供了兼具法定严肃度与人本温度的可落地范式。</w:t>
       </w:r>
     </w:p>
     <w:p>
@@ -1179,18 +1201,19 @@
     </w:p>
     <w:p>
       <w:pPr>
-        <w:spacing w:before="80" w:after="80"/>
+        <w:spacing w:before="100" w:after="100"/>
         <w:jc w:val="center"/>
       </w:pPr>
       <w:r>
         <w:rPr>
-          <w:rFonts w:ascii="Times New Roman" w:hAnsi="Times New Roman"/>
+          <w:rFonts w:ascii="Cambria Math" w:hAnsi="Cambria Math"/>
           <w:b w:val="0"/>
           <w:i/>
-          <w:sz w:val="22"/>
-          <w:rFonts w:ascii="Times New Roman" w:hAnsi="Times New Roman" w:eastAsia="Times New Roman"/>
-        </w:rPr>
-        <w:t>\text{IF } P_1 \wedge P_2 \wedge \dots \wedge P_k \text{ THEN } Q \quad (\text{CF} = 1.0)</w:t>
+          <w:color w:val="101828"/>
+          <w:sz w:val="23"/>
+          <w:rFonts w:ascii="Cambria Math" w:hAnsi="Cambria Math" w:eastAsia="Cambria Math"/>
+        </w:rPr>
+        <w:t>IF  P_1 ∧ P_2 ∧ … ∧ P_k  THEN  Q    (CF = 1.0)</w:t>
       </w:r>
     </w:p>
     <w:p>
@@ -1207,7 +1230,51 @@
           <w:sz w:val="22"/>
           <w:rFonts w:ascii="Times New Roman" w:hAnsi="Times New Roman" w:eastAsia="宋体"/>
         </w:rPr>
-        <w:t>其中 $P_i$ 为前件谓词条件，$Q$ 为后件结论。</w:t>
+        <w:t xml:space="preserve">其中 </w:t>
+      </w:r>
+      <w:r>
+        <w:rPr>
+          <w:rFonts w:ascii="Cambria Math" w:hAnsi="Cambria Math"/>
+          <w:b w:val="0"/>
+          <w:i/>
+          <w:color w:val="101828"/>
+          <w:sz w:val="22"/>
+          <w:rFonts w:ascii="Cambria Math" w:hAnsi="Cambria Math" w:eastAsia="Cambria Math"/>
+        </w:rPr>
+        <w:t>P_i</w:t>
+      </w:r>
+      <w:r>
+        <w:rPr>
+          <w:rFonts w:ascii="Times New Roman" w:hAnsi="Times New Roman"/>
+          <w:b w:val="0"/>
+          <w:i w:val="0"/>
+          <w:color w:val="1D2939"/>
+          <w:sz w:val="22"/>
+          <w:rFonts w:ascii="Times New Roman" w:hAnsi="Times New Roman" w:eastAsia="宋体"/>
+        </w:rPr>
+        <w:t xml:space="preserve"> 为前件谓词条件，</w:t>
+      </w:r>
+      <w:r>
+        <w:rPr>
+          <w:rFonts w:ascii="Cambria Math" w:hAnsi="Cambria Math"/>
+          <w:b w:val="0"/>
+          <w:i/>
+          <w:color w:val="101828"/>
+          <w:sz w:val="22"/>
+          <w:rFonts w:ascii="Cambria Math" w:hAnsi="Cambria Math" w:eastAsia="Cambria Math"/>
+        </w:rPr>
+        <w:t>Q</w:t>
+      </w:r>
+      <w:r>
+        <w:rPr>
+          <w:rFonts w:ascii="Times New Roman" w:hAnsi="Times New Roman"/>
+          <w:b w:val="0"/>
+          <w:i w:val="0"/>
+          <w:color w:val="1D2939"/>
+          <w:sz w:val="22"/>
+          <w:rFonts w:ascii="Times New Roman" w:hAnsi="Times New Roman" w:eastAsia="宋体"/>
+        </w:rPr>
+        <w:t xml:space="preserve"> 为后件结论。</w:t>
       </w:r>
     </w:p>
     <w:p>
@@ -1241,23 +1308,68 @@
           <w:sz w:val="22"/>
           <w:rFonts w:ascii="Times New Roman" w:hAnsi="Times New Roman" w:eastAsia="宋体"/>
         </w:rPr>
-        <w:t>正向链是一种数据驱动（Data-driven）的推导方式：从已知事实集合 $\mathcal{F}_0$ 出发，匹配规则库中前提已全部满足的规则，激活并执行规则动作，将推导出的新事实 $Q$ 插入工作内存，重复迭代直至达到不动点（Fixed Point）：</w:t>
+        <w:t xml:space="preserve">正向链是一种数据驱动（Data-driven）的推导方式：从已知事实集合 </w:t>
+      </w:r>
+      <w:r>
+        <w:rPr>
+          <w:rFonts w:ascii="Cambria Math" w:hAnsi="Cambria Math"/>
+          <w:b w:val="0"/>
+          <w:i/>
+          <w:color w:val="101828"/>
+          <w:sz w:val="22"/>
+          <w:rFonts w:ascii="Cambria Math" w:hAnsi="Cambria Math" w:eastAsia="Cambria Math"/>
+        </w:rPr>
+        <w:t>F_0</w:t>
+      </w:r>
+      <w:r>
+        <w:rPr>
+          <w:rFonts w:ascii="Times New Roman" w:hAnsi="Times New Roman"/>
+          <w:b w:val="0"/>
+          <w:i w:val="0"/>
+          <w:color w:val="1D2939"/>
+          <w:sz w:val="22"/>
+          <w:rFonts w:ascii="Times New Roman" w:hAnsi="Times New Roman" w:eastAsia="宋体"/>
+        </w:rPr>
+        <w:t xml:space="preserve"> 出发，匹配规则库中前提已全部满足的规则，激活并执行规则动作，将推导出的新事实 </w:t>
+      </w:r>
+      <w:r>
+        <w:rPr>
+          <w:rFonts w:ascii="Cambria Math" w:hAnsi="Cambria Math"/>
+          <w:b w:val="0"/>
+          <w:i/>
+          <w:color w:val="101828"/>
+          <w:sz w:val="22"/>
+          <w:rFonts w:ascii="Cambria Math" w:hAnsi="Cambria Math" w:eastAsia="Cambria Math"/>
+        </w:rPr>
+        <w:t>Q</w:t>
+      </w:r>
+      <w:r>
+        <w:rPr>
+          <w:rFonts w:ascii="Times New Roman" w:hAnsi="Times New Roman"/>
+          <w:b w:val="0"/>
+          <w:i w:val="0"/>
+          <w:color w:val="1D2939"/>
+          <w:sz w:val="22"/>
+          <w:rFonts w:ascii="Times New Roman" w:hAnsi="Times New Roman" w:eastAsia="宋体"/>
+        </w:rPr>
+        <w:t xml:space="preserve"> 插入工作内存，重复迭代直至达到不动点（Fixed Point）：</w:t>
       </w:r>
     </w:p>
     <w:p>
       <w:pPr>
-        <w:spacing w:before="80" w:after="80"/>
+        <w:spacing w:before="100" w:after="100"/>
         <w:jc w:val="center"/>
       </w:pPr>
       <w:r>
         <w:rPr>
-          <w:rFonts w:ascii="Times New Roman" w:hAnsi="Times New Roman"/>
+          <w:rFonts w:ascii="Cambria Math" w:hAnsi="Cambria Math"/>
           <w:b w:val="0"/>
           <w:i/>
-          <w:sz w:val="22"/>
-          <w:rFonts w:ascii="Times New Roman" w:hAnsi="Times New Roman" w:eastAsia="Times New Roman"/>
-        </w:rPr>
-        <w:t>\mathcal{F}_{t+1} = \mathcal{F}_t \cup \left\{ Q \mid (P_1 \wedge \dots \wedge P_k \Rightarrow Q) \in \mathcal{R}, \bigwedge_{i=1}^k P_i \in \mathcal{F}_t \right\}</w:t>
+          <w:color w:val="101828"/>
+          <w:sz w:val="23"/>
+          <w:rFonts w:ascii="Cambria Math" w:hAnsi="Cambria Math" w:eastAsia="Cambria Math"/>
+        </w:rPr>
+        <w:t>F_{t+1} = F_t ∪ { Q | (P_1 ∧ … ∧ P_k ⇒ Q) ∈ R, bigwedge_{i=1}^k P_i ∈ F_t }</w:t>
       </w:r>
     </w:p>
     <w:p>
@@ -1352,7 +1464,73 @@
           <w:sz w:val="22"/>
           <w:rFonts w:ascii="Times New Roman" w:hAnsi="Times New Roman" w:eastAsia="宋体"/>
         </w:rPr>
-        <w:t>反向链是一种目标驱动（Goal-driven）的推导方式：给定待证明的目标假设 $G$，推理机逆向查找结论包含 $G$ 的规则集合，并将该规则的前件分解为子目标 $P_1, \dots, P_k$；递归调用推导引擎，直到所有叶子子目标均在已知事实中命中，或无可替代规则而宣告失败。</w:t>
+        <w:t xml:space="preserve">反向链是一种目标驱动（Goal-driven）的推导方式：给定待证明的目标假设 </w:t>
+      </w:r>
+      <w:r>
+        <w:rPr>
+          <w:rFonts w:ascii="Cambria Math" w:hAnsi="Cambria Math"/>
+          <w:b w:val="0"/>
+          <w:i/>
+          <w:color w:val="101828"/>
+          <w:sz w:val="22"/>
+          <w:rFonts w:ascii="Cambria Math" w:hAnsi="Cambria Math" w:eastAsia="Cambria Math"/>
+        </w:rPr>
+        <w:t>G</w:t>
+      </w:r>
+      <w:r>
+        <w:rPr>
+          <w:rFonts w:ascii="Times New Roman" w:hAnsi="Times New Roman"/>
+          <w:b w:val="0"/>
+          <w:i w:val="0"/>
+          <w:color w:val="1D2939"/>
+          <w:sz w:val="22"/>
+          <w:rFonts w:ascii="Times New Roman" w:hAnsi="Times New Roman" w:eastAsia="宋体"/>
+        </w:rPr>
+        <w:t xml:space="preserve">，推理机逆向查找结论包含 </w:t>
+      </w:r>
+      <w:r>
+        <w:rPr>
+          <w:rFonts w:ascii="Cambria Math" w:hAnsi="Cambria Math"/>
+          <w:b w:val="0"/>
+          <w:i/>
+          <w:color w:val="101828"/>
+          <w:sz w:val="22"/>
+          <w:rFonts w:ascii="Cambria Math" w:hAnsi="Cambria Math" w:eastAsia="Cambria Math"/>
+        </w:rPr>
+        <w:t>G</w:t>
+      </w:r>
+      <w:r>
+        <w:rPr>
+          <w:rFonts w:ascii="Times New Roman" w:hAnsi="Times New Roman"/>
+          <w:b w:val="0"/>
+          <w:i w:val="0"/>
+          <w:color w:val="1D2939"/>
+          <w:sz w:val="22"/>
+          <w:rFonts w:ascii="Times New Roman" w:hAnsi="Times New Roman" w:eastAsia="宋体"/>
+        </w:rPr>
+        <w:t xml:space="preserve"> 的规则集合，并将该规则的前件分解为子目标 </w:t>
+      </w:r>
+      <w:r>
+        <w:rPr>
+          <w:rFonts w:ascii="Cambria Math" w:hAnsi="Cambria Math"/>
+          <w:b w:val="0"/>
+          <w:i/>
+          <w:color w:val="101828"/>
+          <w:sz w:val="22"/>
+          <w:rFonts w:ascii="Cambria Math" w:hAnsi="Cambria Math" w:eastAsia="Cambria Math"/>
+        </w:rPr>
+        <w:t>P_1, …, P_k</w:t>
+      </w:r>
+      <w:r>
+        <w:rPr>
+          <w:rFonts w:ascii="Times New Roman" w:hAnsi="Times New Roman"/>
+          <w:b w:val="0"/>
+          <w:i w:val="0"/>
+          <w:color w:val="1D2939"/>
+          <w:sz w:val="22"/>
+          <w:rFonts w:ascii="Times New Roman" w:hAnsi="Times New Roman" w:eastAsia="宋体"/>
+        </w:rPr>
+        <w:t>；递归调用推导引擎，直到所有叶子子目标均在已知事实中命中，或无可替代规则而宣告失败。</w:t>
       </w:r>
     </w:p>
     <w:p>
@@ -1454,23 +1632,90 @@
           <w:sz w:val="22"/>
           <w:rFonts w:ascii="Times New Roman" w:hAnsi="Times New Roman" w:eastAsia="宋体"/>
         </w:rPr>
-        <w:t>设 $\Theta = \{\theta_1, \theta_2, \dots, \theta_n\}$ 为互斥且完备的命题全集，其幂集为 $2^\Theta$。基本概率分配函数（Basic Probability Assignment, BPA，又称质量函数 $m$）满足：</w:t>
+        <w:t xml:space="preserve">设 </w:t>
+      </w:r>
+      <w:r>
+        <w:rPr>
+          <w:rFonts w:ascii="Cambria Math" w:hAnsi="Cambria Math"/>
+          <w:b w:val="0"/>
+          <w:i/>
+          <w:color w:val="101828"/>
+          <w:sz w:val="22"/>
+          <w:rFonts w:ascii="Cambria Math" w:hAnsi="Cambria Math" w:eastAsia="Cambria Math"/>
+        </w:rPr>
+        <w:t>Θ = {θ_1, θ_2, …, θ_n}</w:t>
+      </w:r>
+      <w:r>
+        <w:rPr>
+          <w:rFonts w:ascii="Times New Roman" w:hAnsi="Times New Roman"/>
+          <w:b w:val="0"/>
+          <w:i w:val="0"/>
+          <w:color w:val="1D2939"/>
+          <w:sz w:val="22"/>
+          <w:rFonts w:ascii="Times New Roman" w:hAnsi="Times New Roman" w:eastAsia="宋体"/>
+        </w:rPr>
+        <w:t xml:space="preserve"> 为互斥且完备的命题全集，其幂集为 </w:t>
+      </w:r>
+      <w:r>
+        <w:rPr>
+          <w:rFonts w:ascii="Cambria Math" w:hAnsi="Cambria Math"/>
+          <w:b w:val="0"/>
+          <w:i/>
+          <w:color w:val="101828"/>
+          <w:sz w:val="22"/>
+          <w:rFonts w:ascii="Cambria Math" w:hAnsi="Cambria Math" w:eastAsia="Cambria Math"/>
+        </w:rPr>
+        <w:t>2^Θ</w:t>
+      </w:r>
+      <w:r>
+        <w:rPr>
+          <w:rFonts w:ascii="Times New Roman" w:hAnsi="Times New Roman"/>
+          <w:b w:val="0"/>
+          <w:i w:val="0"/>
+          <w:color w:val="1D2939"/>
+          <w:sz w:val="22"/>
+          <w:rFonts w:ascii="Times New Roman" w:hAnsi="Times New Roman" w:eastAsia="宋体"/>
+        </w:rPr>
+        <w:t xml:space="preserve">。基本概率分配函数（Basic Probability Assignment, BPA，又称质量函数 </w:t>
+      </w:r>
+      <w:r>
+        <w:rPr>
+          <w:rFonts w:ascii="Cambria Math" w:hAnsi="Cambria Math"/>
+          <w:b w:val="0"/>
+          <w:i/>
+          <w:color w:val="101828"/>
+          <w:sz w:val="22"/>
+          <w:rFonts w:ascii="Cambria Math" w:hAnsi="Cambria Math" w:eastAsia="Cambria Math"/>
+        </w:rPr>
+        <w:t>m</w:t>
+      </w:r>
+      <w:r>
+        <w:rPr>
+          <w:rFonts w:ascii="Times New Roman" w:hAnsi="Times New Roman"/>
+          <w:b w:val="0"/>
+          <w:i w:val="0"/>
+          <w:color w:val="1D2939"/>
+          <w:sz w:val="22"/>
+          <w:rFonts w:ascii="Times New Roman" w:hAnsi="Times New Roman" w:eastAsia="宋体"/>
+        </w:rPr>
+        <w:t>）满足：</w:t>
       </w:r>
     </w:p>
     <w:p>
       <w:pPr>
-        <w:spacing w:before="80" w:after="80"/>
+        <w:spacing w:before="100" w:after="100"/>
         <w:jc w:val="center"/>
       </w:pPr>
       <w:r>
         <w:rPr>
-          <w:rFonts w:ascii="Times New Roman" w:hAnsi="Times New Roman"/>
+          <w:rFonts w:ascii="Cambria Math" w:hAnsi="Cambria Math"/>
           <w:b w:val="0"/>
           <w:i/>
-          <w:sz w:val="22"/>
-          <w:rFonts w:ascii="Times New Roman" w:hAnsi="Times New Roman" w:eastAsia="Times New Roman"/>
-        </w:rPr>
-        <w:t>m(\emptyset) = 0, \quad \sum_{A \subseteq \Theta} m(A) = 1</w:t>
+          <w:color w:val="101828"/>
+          <w:sz w:val="23"/>
+          <w:rFonts w:ascii="Cambria Math" w:hAnsi="Cambria Math" w:eastAsia="Cambria Math"/>
+        </w:rPr>
+        <w:t>m(∅) = 0,    ∑_{A ⊆ Θ} m(A) = 1</w:t>
       </w:r>
     </w:p>
     <w:p>
@@ -1487,23 +1732,68 @@
           <w:sz w:val="22"/>
           <w:rFonts w:ascii="Times New Roman" w:hAnsi="Times New Roman" w:eastAsia="宋体"/>
         </w:rPr>
-        <w:t>对于两个独立证据源 $m_1$ 和 $m_2$，经典的 Dempster 正交组合规则定义为：</w:t>
+        <w:t xml:space="preserve">对于两个独立证据源 </w:t>
+      </w:r>
+      <w:r>
+        <w:rPr>
+          <w:rFonts w:ascii="Cambria Math" w:hAnsi="Cambria Math"/>
+          <w:b w:val="0"/>
+          <w:i/>
+          <w:color w:val="101828"/>
+          <w:sz w:val="22"/>
+          <w:rFonts w:ascii="Cambria Math" w:hAnsi="Cambria Math" w:eastAsia="Cambria Math"/>
+        </w:rPr>
+        <w:t>m_1</w:t>
+      </w:r>
+      <w:r>
+        <w:rPr>
+          <w:rFonts w:ascii="Times New Roman" w:hAnsi="Times New Roman"/>
+          <w:b w:val="0"/>
+          <w:i w:val="0"/>
+          <w:color w:val="1D2939"/>
+          <w:sz w:val="22"/>
+          <w:rFonts w:ascii="Times New Roman" w:hAnsi="Times New Roman" w:eastAsia="宋体"/>
+        </w:rPr>
+        <w:t xml:space="preserve"> 和 </w:t>
+      </w:r>
+      <w:r>
+        <w:rPr>
+          <w:rFonts w:ascii="Cambria Math" w:hAnsi="Cambria Math"/>
+          <w:b w:val="0"/>
+          <w:i/>
+          <w:color w:val="101828"/>
+          <w:sz w:val="22"/>
+          <w:rFonts w:ascii="Cambria Math" w:hAnsi="Cambria Math" w:eastAsia="Cambria Math"/>
+        </w:rPr>
+        <w:t>m_2</w:t>
+      </w:r>
+      <w:r>
+        <w:rPr>
+          <w:rFonts w:ascii="Times New Roman" w:hAnsi="Times New Roman"/>
+          <w:b w:val="0"/>
+          <w:i w:val="0"/>
+          <w:color w:val="1D2939"/>
+          <w:sz w:val="22"/>
+          <w:rFonts w:ascii="Times New Roman" w:hAnsi="Times New Roman" w:eastAsia="宋体"/>
+        </w:rPr>
+        <w:t>，经典的 Dempster 正交组合规则定义为：</w:t>
       </w:r>
     </w:p>
     <w:p>
       <w:pPr>
-        <w:spacing w:before="80" w:after="80"/>
+        <w:spacing w:before="100" w:after="100"/>
         <w:jc w:val="center"/>
       </w:pPr>
       <w:r>
         <w:rPr>
-          <w:rFonts w:ascii="Times New Roman" w:hAnsi="Times New Roman"/>
+          <w:rFonts w:ascii="Cambria Math" w:hAnsi="Cambria Math"/>
           <w:b w:val="0"/>
           <w:i/>
-          <w:sz w:val="22"/>
-          <w:rFonts w:ascii="Times New Roman" w:hAnsi="Times New Roman" w:eastAsia="Times New Roman"/>
-        </w:rPr>
-        <w:t>(m_1 \oplus m_2)(A) = \frac{1}{1 - K} \sum_{B \cap C = A} m_1(B) m_2(C), \quad \forall A \neq \emptyset</w:t>
+          <w:color w:val="101828"/>
+          <w:sz w:val="23"/>
+          <w:rFonts w:ascii="Cambria Math" w:hAnsi="Cambria Math" w:eastAsia="Cambria Math"/>
+        </w:rPr>
+        <w:t>(m_1 ⊕ m_2)(A) = [1] / [1 - K] ∑_{B ∩ C = A} m_1(B) m_2(C),    ∀ A ≠ ∅</w:t>
       </w:r>
     </w:p>
     <w:p>
@@ -1520,7 +1810,29 @@
           <w:sz w:val="22"/>
           <w:rFonts w:ascii="Times New Roman" w:hAnsi="Times New Roman" w:eastAsia="宋体"/>
         </w:rPr>
-        <w:t>其中 $K$ 为</w:t>
+        <w:t xml:space="preserve">其中 </w:t>
+      </w:r>
+      <w:r>
+        <w:rPr>
+          <w:rFonts w:ascii="Cambria Math" w:hAnsi="Cambria Math"/>
+          <w:b w:val="0"/>
+          <w:i/>
+          <w:color w:val="101828"/>
+          <w:sz w:val="22"/>
+          <w:rFonts w:ascii="Cambria Math" w:hAnsi="Cambria Math" w:eastAsia="Cambria Math"/>
+        </w:rPr>
+        <w:t>K</w:t>
+      </w:r>
+      <w:r>
+        <w:rPr>
+          <w:rFonts w:ascii="Times New Roman" w:hAnsi="Times New Roman"/>
+          <w:b w:val="0"/>
+          <w:i w:val="0"/>
+          <w:color w:val="1D2939"/>
+          <w:sz w:val="22"/>
+          <w:rFonts w:ascii="Times New Roman" w:hAnsi="Times New Roman" w:eastAsia="宋体"/>
+        </w:rPr>
+        <w:t xml:space="preserve"> 为</w:t>
       </w:r>
       <w:r>
         <w:rPr>
@@ -1547,18 +1859,19 @@
     </w:p>
     <w:p>
       <w:pPr>
-        <w:spacing w:before="80" w:after="80"/>
+        <w:spacing w:before="100" w:after="100"/>
         <w:jc w:val="center"/>
       </w:pPr>
       <w:r>
         <w:rPr>
-          <w:rFonts w:ascii="Times New Roman" w:hAnsi="Times New Roman"/>
+          <w:rFonts w:ascii="Cambria Math" w:hAnsi="Cambria Math"/>
           <w:b w:val="0"/>
           <w:i/>
-          <w:sz w:val="22"/>
-          <w:rFonts w:ascii="Times New Roman" w:hAnsi="Times New Roman" w:eastAsia="Times New Roman"/>
-        </w:rPr>
-        <w:t>K = \sum_{B \cap C = \emptyset} m_1(B) m_2(C)</w:t>
+          <w:color w:val="101828"/>
+          <w:sz w:val="23"/>
+          <w:rFonts w:ascii="Cambria Math" w:hAnsi="Cambria Math" w:eastAsia="Cambria Math"/>
+        </w:rPr>
+        <w:t>K = ∑_{B ∩ C = ∅} m_1(B) m_2(C)</w:t>
       </w:r>
     </w:p>
     <w:p>
@@ -1592,7 +1905,51 @@
           <w:sz w:val="22"/>
           <w:rFonts w:ascii="Times New Roman" w:hAnsi="Times New Roman" w:eastAsia="宋体"/>
         </w:rPr>
-        <w:t>当证据源之间存在高度冲突时（即 $K \to 1$），分母 $1-K \to 0$，会导致归一化因子产生病态放大。</w:t>
+        <w:t xml:space="preserve">当证据源之间存在高度冲突时（即 </w:t>
+      </w:r>
+      <w:r>
+        <w:rPr>
+          <w:rFonts w:ascii="Cambria Math" w:hAnsi="Cambria Math"/>
+          <w:b w:val="0"/>
+          <w:i/>
+          <w:color w:val="101828"/>
+          <w:sz w:val="22"/>
+          <w:rFonts w:ascii="Cambria Math" w:hAnsi="Cambria Math" w:eastAsia="Cambria Math"/>
+        </w:rPr>
+        <w:t>K to 1</w:t>
+      </w:r>
+      <w:r>
+        <w:rPr>
+          <w:rFonts w:ascii="Times New Roman" w:hAnsi="Times New Roman"/>
+          <w:b w:val="0"/>
+          <w:i w:val="0"/>
+          <w:color w:val="1D2939"/>
+          <w:sz w:val="22"/>
+          <w:rFonts w:ascii="Times New Roman" w:hAnsi="Times New Roman" w:eastAsia="宋体"/>
+        </w:rPr>
+        <w:t xml:space="preserve">），分母 </w:t>
+      </w:r>
+      <w:r>
+        <w:rPr>
+          <w:rFonts w:ascii="Cambria Math" w:hAnsi="Cambria Math"/>
+          <w:b w:val="0"/>
+          <w:i/>
+          <w:color w:val="101828"/>
+          <w:sz w:val="22"/>
+          <w:rFonts w:ascii="Cambria Math" w:hAnsi="Cambria Math" w:eastAsia="Cambria Math"/>
+        </w:rPr>
+        <w:t>1-K to 0</w:t>
+      </w:r>
+      <w:r>
+        <w:rPr>
+          <w:rFonts w:ascii="Times New Roman" w:hAnsi="Times New Roman"/>
+          <w:b w:val="0"/>
+          <w:i w:val="0"/>
+          <w:color w:val="1D2939"/>
+          <w:sz w:val="22"/>
+          <w:rFonts w:ascii="Times New Roman" w:hAnsi="Times New Roman" w:eastAsia="宋体"/>
+        </w:rPr>
+        <w:t>，会导致归一化因子产生病态放大。</w:t>
       </w:r>
     </w:p>
     <w:p>
@@ -1620,7 +1977,29 @@
           <w:sz w:val="22"/>
           <w:rFonts w:ascii="Times New Roman" w:hAnsi="Times New Roman" w:eastAsia="宋体"/>
         </w:rPr>
-        <w:t>：假设识别框架 $\Theta = \{A, B, C\}$。</w:t>
+        <w:t xml:space="preserve">：假设识别框架 </w:t>
+      </w:r>
+      <w:r>
+        <w:rPr>
+          <w:rFonts w:ascii="Cambria Math" w:hAnsi="Cambria Math"/>
+          <w:b w:val="0"/>
+          <w:i/>
+          <w:color w:val="101828"/>
+          <w:sz w:val="22"/>
+          <w:rFonts w:ascii="Cambria Math" w:hAnsi="Cambria Math" w:eastAsia="Cambria Math"/>
+        </w:rPr>
+        <w:t>Θ = {A, B, C}</w:t>
+      </w:r>
+      <w:r>
+        <w:rPr>
+          <w:rFonts w:ascii="Times New Roman" w:hAnsi="Times New Roman"/>
+          <w:b w:val="0"/>
+          <w:i w:val="0"/>
+          <w:color w:val="1D2939"/>
+          <w:sz w:val="22"/>
+          <w:rFonts w:ascii="Times New Roman" w:hAnsi="Times New Roman" w:eastAsia="宋体"/>
+        </w:rPr>
+        <w:t>。</w:t>
       </w:r>
     </w:p>
     <w:p>
@@ -1637,7 +2016,29 @@
           <w:sz w:val="22"/>
           <w:rFonts w:ascii="Times New Roman" w:hAnsi="Times New Roman" w:eastAsia="宋体"/>
         </w:rPr>
-        <w:t>证据 1：$m_1(A) = 0.99, m_1(B) = 0.01, m_1(C) = 0.00$；</w:t>
+        <w:t>证据 1：</w:t>
+      </w:r>
+      <w:r>
+        <w:rPr>
+          <w:rFonts w:ascii="Cambria Math" w:hAnsi="Cambria Math"/>
+          <w:b w:val="0"/>
+          <w:i/>
+          <w:color w:val="101828"/>
+          <w:sz w:val="22"/>
+          <w:rFonts w:ascii="Cambria Math" w:hAnsi="Cambria Math" w:eastAsia="Cambria Math"/>
+        </w:rPr>
+        <w:t>m_1(A) = 0.99, m_1(B) = 0.01, m_1(C) = 0.00</w:t>
+      </w:r>
+      <w:r>
+        <w:rPr>
+          <w:rFonts w:ascii="Times New Roman" w:hAnsi="Times New Roman"/>
+          <w:b w:val="0"/>
+          <w:i w:val="0"/>
+          <w:color w:val="1D2939"/>
+          <w:sz w:val="22"/>
+          <w:rFonts w:ascii="Times New Roman" w:hAnsi="Times New Roman" w:eastAsia="宋体"/>
+        </w:rPr>
+        <w:t>；</w:t>
       </w:r>
     </w:p>
     <w:p>
@@ -1654,7 +2055,29 @@
           <w:sz w:val="22"/>
           <w:rFonts w:ascii="Times New Roman" w:hAnsi="Times New Roman" w:eastAsia="宋体"/>
         </w:rPr>
-        <w:t>证据 2：$m_2(A) = 0.00, m_2(B) = 0.01, m_2(C) = 0.99$。</w:t>
+        <w:t>证据 2：</w:t>
+      </w:r>
+      <w:r>
+        <w:rPr>
+          <w:rFonts w:ascii="Cambria Math" w:hAnsi="Cambria Math"/>
+          <w:b w:val="0"/>
+          <w:i/>
+          <w:color w:val="101828"/>
+          <w:sz w:val="22"/>
+          <w:rFonts w:ascii="Cambria Math" w:hAnsi="Cambria Math" w:eastAsia="Cambria Math"/>
+        </w:rPr>
+        <w:t>m_2(A) = 0.00, m_2(B) = 0.01, m_2(C) = 0.99</w:t>
+      </w:r>
+      <w:r>
+        <w:rPr>
+          <w:rFonts w:ascii="Times New Roman" w:hAnsi="Times New Roman"/>
+          <w:b w:val="0"/>
+          <w:i w:val="0"/>
+          <w:color w:val="1D2939"/>
+          <w:sz w:val="22"/>
+          <w:rFonts w:ascii="Times New Roman" w:hAnsi="Times New Roman" w:eastAsia="宋体"/>
+        </w:rPr>
+        <w:t>。</w:t>
       </w:r>
     </w:p>
     <w:p>
@@ -1671,7 +2094,73 @@
           <w:sz w:val="22"/>
           <w:rFonts w:ascii="Times New Roman" w:hAnsi="Times New Roman" w:eastAsia="宋体"/>
         </w:rPr>
-        <w:t>计算非空交集：仅 $B \cap B = B$，积为 $m_1(B)m_2(B) = 0.0001$；冲突项 $K = 0.99 \times 0.99 + 0.99 \times 0.01 + 0.01 \times 0.99 = 0.9999$。</w:t>
+        <w:t xml:space="preserve">计算非空交集：仅 </w:t>
+      </w:r>
+      <w:r>
+        <w:rPr>
+          <w:rFonts w:ascii="Cambria Math" w:hAnsi="Cambria Math"/>
+          <w:b w:val="0"/>
+          <w:i/>
+          <w:color w:val="101828"/>
+          <w:sz w:val="22"/>
+          <w:rFonts w:ascii="Cambria Math" w:hAnsi="Cambria Math" w:eastAsia="Cambria Math"/>
+        </w:rPr>
+        <w:t>B ∩ B = B</w:t>
+      </w:r>
+      <w:r>
+        <w:rPr>
+          <w:rFonts w:ascii="Times New Roman" w:hAnsi="Times New Roman"/>
+          <w:b w:val="0"/>
+          <w:i w:val="0"/>
+          <w:color w:val="1D2939"/>
+          <w:sz w:val="22"/>
+          <w:rFonts w:ascii="Times New Roman" w:hAnsi="Times New Roman" w:eastAsia="宋体"/>
+        </w:rPr>
+        <w:t xml:space="preserve">，积为 </w:t>
+      </w:r>
+      <w:r>
+        <w:rPr>
+          <w:rFonts w:ascii="Cambria Math" w:hAnsi="Cambria Math"/>
+          <w:b w:val="0"/>
+          <w:i/>
+          <w:color w:val="101828"/>
+          <w:sz w:val="22"/>
+          <w:rFonts w:ascii="Cambria Math" w:hAnsi="Cambria Math" w:eastAsia="Cambria Math"/>
+        </w:rPr>
+        <w:t>m_1(B)m_2(B) = 0.0001</w:t>
+      </w:r>
+      <w:r>
+        <w:rPr>
+          <w:rFonts w:ascii="Times New Roman" w:hAnsi="Times New Roman"/>
+          <w:b w:val="0"/>
+          <w:i w:val="0"/>
+          <w:color w:val="1D2939"/>
+          <w:sz w:val="22"/>
+          <w:rFonts w:ascii="Times New Roman" w:hAnsi="Times New Roman" w:eastAsia="宋体"/>
+        </w:rPr>
+        <w:t xml:space="preserve">；冲突项 </w:t>
+      </w:r>
+      <w:r>
+        <w:rPr>
+          <w:rFonts w:ascii="Cambria Math" w:hAnsi="Cambria Math"/>
+          <w:b w:val="0"/>
+          <w:i/>
+          <w:color w:val="101828"/>
+          <w:sz w:val="22"/>
+          <w:rFonts w:ascii="Cambria Math" w:hAnsi="Cambria Math" w:eastAsia="Cambria Math"/>
+        </w:rPr>
+        <w:t>K = 0.99 × 0.99 + 0.99 × 0.01 + 0.01 × 0.99 = 0.9999</w:t>
+      </w:r>
+      <w:r>
+        <w:rPr>
+          <w:rFonts w:ascii="Times New Roman" w:hAnsi="Times New Roman"/>
+          <w:b w:val="0"/>
+          <w:i w:val="0"/>
+          <w:color w:val="1D2939"/>
+          <w:sz w:val="22"/>
+          <w:rFonts w:ascii="Times New Roman" w:hAnsi="Times New Roman" w:eastAsia="宋体"/>
+        </w:rPr>
+        <w:t>。</w:t>
       </w:r>
     </w:p>
     <w:p>
@@ -1693,18 +2182,19 @@
     </w:p>
     <w:p>
       <w:pPr>
-        <w:spacing w:before="80" w:after="80"/>
+        <w:spacing w:before="100" w:after="100"/>
         <w:jc w:val="center"/>
       </w:pPr>
       <w:r>
         <w:rPr>
-          <w:rFonts w:ascii="Times New Roman" w:hAnsi="Times New Roman"/>
+          <w:rFonts w:ascii="Cambria Math" w:hAnsi="Cambria Math"/>
           <w:b w:val="0"/>
           <w:i/>
-          <w:sz w:val="22"/>
-          <w:rFonts w:ascii="Times New Roman" w:hAnsi="Times New Roman" w:eastAsia="Times New Roman"/>
-        </w:rPr>
-        <w:t>(m_1 \oplus m_2)(B) = \frac{0.0001}{1 - 0.9999} = 1.0</w:t>
+          <w:color w:val="101828"/>
+          <w:sz w:val="23"/>
+          <w:rFonts w:ascii="Cambria Math" w:hAnsi="Cambria Math" w:eastAsia="Cambria Math"/>
+        </w:rPr>
+        <w:t>(m_1 ⊕ m_2)(B) = [0.0001] / [1 - 0.9999] = 1.0</w:t>
       </w:r>
     </w:p>
     <w:p>
@@ -1732,7 +2222,29 @@
           <w:sz w:val="22"/>
           <w:rFonts w:ascii="Times New Roman" w:hAnsi="Times New Roman" w:eastAsia="宋体"/>
         </w:rPr>
-        <w:t>：两个证据源都几乎断定不可能成立的命题 $B$（置信度仅 1%），在组合后居然获得了 100% 的绝对确信度！这在工业风控与司法判决中是灾难性的。</w:t>
+        <w:t xml:space="preserve">：两个证据源都几乎断定不可能成立的命题 </w:t>
+      </w:r>
+      <w:r>
+        <w:rPr>
+          <w:rFonts w:ascii="Cambria Math" w:hAnsi="Cambria Math"/>
+          <w:b w:val="0"/>
+          <w:i/>
+          <w:color w:val="101828"/>
+          <w:sz w:val="22"/>
+          <w:rFonts w:ascii="Cambria Math" w:hAnsi="Cambria Math" w:eastAsia="Cambria Math"/>
+        </w:rPr>
+        <w:t>B</w:t>
+      </w:r>
+      <w:r>
+        <w:rPr>
+          <w:rFonts w:ascii="Times New Roman" w:hAnsi="Times New Roman"/>
+          <w:b w:val="0"/>
+          <w:i w:val="0"/>
+          <w:color w:val="1D2939"/>
+          <w:sz w:val="22"/>
+          <w:rFonts w:ascii="Times New Roman" w:hAnsi="Times New Roman" w:eastAsia="宋体"/>
+        </w:rPr>
+        <w:t>（置信度仅 1%），在组合后居然获得了 100% 的绝对确信度！这在工业风控与司法判决中是灾难性的。</w:t>
       </w:r>
     </w:p>
     <w:p>
@@ -1783,23 +2295,68 @@
           <w:sz w:val="22"/>
           <w:rFonts w:ascii="Times New Roman" w:hAnsi="Times New Roman" w:eastAsia="宋体"/>
         </w:rPr>
-        <w:t>1. 对输入的 $n$ 个独立证据源计算算术加权平均质量函数 $\bar{m}$：</w:t>
+        <w:t xml:space="preserve">1. 对输入的 </w:t>
+      </w:r>
+      <w:r>
+        <w:rPr>
+          <w:rFonts w:ascii="Cambria Math" w:hAnsi="Cambria Math"/>
+          <w:b w:val="0"/>
+          <w:i/>
+          <w:color w:val="101828"/>
+          <w:sz w:val="22"/>
+          <w:rFonts w:ascii="Cambria Math" w:hAnsi="Cambria Math" w:eastAsia="Cambria Math"/>
+        </w:rPr>
+        <w:t>n</w:t>
+      </w:r>
+      <w:r>
+        <w:rPr>
+          <w:rFonts w:ascii="Times New Roman" w:hAnsi="Times New Roman"/>
+          <w:b w:val="0"/>
+          <w:i w:val="0"/>
+          <w:color w:val="1D2939"/>
+          <w:sz w:val="22"/>
+          <w:rFonts w:ascii="Times New Roman" w:hAnsi="Times New Roman" w:eastAsia="宋体"/>
+        </w:rPr>
+        <w:t xml:space="preserve"> 个独立证据源计算算术加权平均质量函数 </w:t>
+      </w:r>
+      <w:r>
+        <w:rPr>
+          <w:rFonts w:ascii="Cambria Math" w:hAnsi="Cambria Math"/>
+          <w:b w:val="0"/>
+          <w:i/>
+          <w:color w:val="101828"/>
+          <w:sz w:val="22"/>
+          <w:rFonts w:ascii="Cambria Math" w:hAnsi="Cambria Math" w:eastAsia="Cambria Math"/>
+        </w:rPr>
+        <w:t>m̄</w:t>
+      </w:r>
+      <w:r>
+        <w:rPr>
+          <w:rFonts w:ascii="Times New Roman" w:hAnsi="Times New Roman"/>
+          <w:b w:val="0"/>
+          <w:i w:val="0"/>
+          <w:color w:val="1D2939"/>
+          <w:sz w:val="22"/>
+          <w:rFonts w:ascii="Times New Roman" w:hAnsi="Times New Roman" w:eastAsia="宋体"/>
+        </w:rPr>
+        <w:t>：</w:t>
       </w:r>
     </w:p>
     <w:p>
       <w:pPr>
-        <w:spacing w:before="80" w:after="80"/>
+        <w:spacing w:before="100" w:after="100"/>
         <w:jc w:val="center"/>
       </w:pPr>
       <w:r>
         <w:rPr>
-          <w:rFonts w:ascii="Times New Roman" w:hAnsi="Times New Roman"/>
+          <w:rFonts w:ascii="Cambria Math" w:hAnsi="Cambria Math"/>
           <w:b w:val="0"/>
           <w:i/>
-          <w:sz w:val="22"/>
-          <w:rFonts w:ascii="Times New Roman" w:hAnsi="Times New Roman" w:eastAsia="Times New Roman"/>
-        </w:rPr>
-        <w:t>\bar{m}(A) = \frac{1}{n} \sum_{i=1}^n m_i(A), \quad \forall A \subseteq \Theta</w:t>
+          <w:color w:val="101828"/>
+          <w:sz w:val="23"/>
+          <w:rFonts w:ascii="Cambria Math" w:hAnsi="Cambria Math" w:eastAsia="Cambria Math"/>
+        </w:rPr>
+        <w:t>m̄(A) = [1] / [n] ∑_{i=1}^n m_i(A),    ∀ A ⊆ Θ</w:t>
       </w:r>
     </w:p>
     <w:p>
@@ -1816,23 +2373,68 @@
           <w:sz w:val="22"/>
           <w:rFonts w:ascii="Times New Roman" w:hAnsi="Times New Roman" w:eastAsia="宋体"/>
         </w:rPr>
-        <w:t>2. 将平均证据 $\bar{m}$ 与自身进行 $(n-1)$ 次经典 Dempster 正交和迭代组合：</w:t>
+        <w:t xml:space="preserve">2. 将平均证据 </w:t>
+      </w:r>
+      <w:r>
+        <w:rPr>
+          <w:rFonts w:ascii="Cambria Math" w:hAnsi="Cambria Math"/>
+          <w:b w:val="0"/>
+          <w:i/>
+          <w:color w:val="101828"/>
+          <w:sz w:val="22"/>
+          <w:rFonts w:ascii="Cambria Math" w:hAnsi="Cambria Math" w:eastAsia="Cambria Math"/>
+        </w:rPr>
+        <w:t>m̄</w:t>
+      </w:r>
+      <w:r>
+        <w:rPr>
+          <w:rFonts w:ascii="Times New Roman" w:hAnsi="Times New Roman"/>
+          <w:b w:val="0"/>
+          <w:i w:val="0"/>
+          <w:color w:val="1D2939"/>
+          <w:sz w:val="22"/>
+          <w:rFonts w:ascii="Times New Roman" w:hAnsi="Times New Roman" w:eastAsia="宋体"/>
+        </w:rPr>
+        <w:t xml:space="preserve"> 与自身进行 </w:t>
+      </w:r>
+      <w:r>
+        <w:rPr>
+          <w:rFonts w:ascii="Cambria Math" w:hAnsi="Cambria Math"/>
+          <w:b w:val="0"/>
+          <w:i/>
+          <w:color w:val="101828"/>
+          <w:sz w:val="22"/>
+          <w:rFonts w:ascii="Cambria Math" w:hAnsi="Cambria Math" w:eastAsia="Cambria Math"/>
+        </w:rPr>
+        <w:t>(n-1)</w:t>
+      </w:r>
+      <w:r>
+        <w:rPr>
+          <w:rFonts w:ascii="Times New Roman" w:hAnsi="Times New Roman"/>
+          <w:b w:val="0"/>
+          <w:i w:val="0"/>
+          <w:color w:val="1D2939"/>
+          <w:sz w:val="22"/>
+          <w:rFonts w:ascii="Times New Roman" w:hAnsi="Times New Roman" w:eastAsia="宋体"/>
+        </w:rPr>
+        <w:t xml:space="preserve"> 次经典 Dempster 正交和迭代组合：</w:t>
       </w:r>
     </w:p>
     <w:p>
       <w:pPr>
-        <w:spacing w:before="80" w:after="80"/>
+        <w:spacing w:before="100" w:after="100"/>
         <w:jc w:val="center"/>
       </w:pPr>
       <w:r>
         <w:rPr>
-          <w:rFonts w:ascii="Times New Roman" w:hAnsi="Times New Roman"/>
+          <w:rFonts w:ascii="Cambria Math" w:hAnsi="Cambria Math"/>
           <w:b w:val="0"/>
           <w:i/>
-          <w:sz w:val="22"/>
-          <w:rFonts w:ascii="Times New Roman" w:hAnsi="Times New Roman" w:eastAsia="Times New Roman"/>
-        </w:rPr>
-        <w:t>m_{\text{Murphy}} = \underbrace{\bar{m} \oplus \bar{m} \oplus \dots \oplus \bar{m}}_{n \text{ 次}}</w:t>
+          <w:color w:val="101828"/>
+          <w:sz w:val="23"/>
+          <w:rFonts w:ascii="Cambria Math" w:hAnsi="Cambria Math" w:eastAsia="Cambria Math"/>
+        </w:rPr>
+        <w:t>m_{Murphy} = underbrace{m̄ ⊕ m̄ ⊕ … ⊕ m̄}_{n  次}</w:t>
       </w:r>
     </w:p>
     <w:p>
@@ -1883,7 +2485,29 @@
           <w:sz w:val="22"/>
           <w:rFonts w:ascii="Times New Roman" w:hAnsi="Times New Roman" w:eastAsia="宋体"/>
         </w:rPr>
-        <w:t>模糊集合论打破了经典集合非 0 即 1 的特征函数界限，引入隶属度函数 $\mu_A(x) \in [0, 1]$ 刻画概念的渐变边界。</w:t>
+        <w:t xml:space="preserve">模糊集合论打破了经典集合非 0 即 1 的特征函数界限，引入隶属度函数 </w:t>
+      </w:r>
+      <w:r>
+        <w:rPr>
+          <w:rFonts w:ascii="Cambria Math" w:hAnsi="Cambria Math"/>
+          <w:b w:val="0"/>
+          <w:i/>
+          <w:color w:val="101828"/>
+          <w:sz w:val="22"/>
+          <w:rFonts w:ascii="Cambria Math" w:hAnsi="Cambria Math" w:eastAsia="Cambria Math"/>
+        </w:rPr>
+        <w:t>μ_A(x) ∈ [0, 1]</w:t>
+      </w:r>
+      <w:r>
+        <w:rPr>
+          <w:rFonts w:ascii="Times New Roman" w:hAnsi="Times New Roman"/>
+          <w:b w:val="0"/>
+          <w:i w:val="0"/>
+          <w:color w:val="1D2939"/>
+          <w:sz w:val="22"/>
+          <w:rFonts w:ascii="Times New Roman" w:hAnsi="Times New Roman" w:eastAsia="宋体"/>
+        </w:rPr>
+        <w:t xml:space="preserve"> 刻画概念的渐变边界。</w:t>
       </w:r>
     </w:p>
     <w:p>
@@ -1978,23 +2602,46 @@
           <w:sz w:val="22"/>
           <w:rFonts w:ascii="Times New Roman" w:hAnsi="Times New Roman" w:eastAsia="宋体"/>
         </w:rPr>
-        <w:t>：采用 Zadeh 算子计算规则前件激活强度 $\alpha_r$：</w:t>
+        <w:t xml:space="preserve">：采用 Zadeh 算子计算规则前件激活强度 </w:t>
+      </w:r>
+      <w:r>
+        <w:rPr>
+          <w:rFonts w:ascii="Cambria Math" w:hAnsi="Cambria Math"/>
+          <w:b w:val="0"/>
+          <w:i/>
+          <w:color w:val="101828"/>
+          <w:sz w:val="22"/>
+          <w:rFonts w:ascii="Cambria Math" w:hAnsi="Cambria Math" w:eastAsia="Cambria Math"/>
+        </w:rPr>
+        <w:t>α_r</w:t>
+      </w:r>
+      <w:r>
+        <w:rPr>
+          <w:rFonts w:ascii="Times New Roman" w:hAnsi="Times New Roman"/>
+          <w:b w:val="0"/>
+          <w:i w:val="0"/>
+          <w:color w:val="1D2939"/>
+          <w:sz w:val="22"/>
+          <w:rFonts w:ascii="Times New Roman" w:hAnsi="Times New Roman" w:eastAsia="宋体"/>
+        </w:rPr>
+        <w:t>：</w:t>
       </w:r>
     </w:p>
     <w:p>
       <w:pPr>
-        <w:spacing w:before="80" w:after="80"/>
+        <w:spacing w:before="100" w:after="100"/>
         <w:jc w:val="center"/>
       </w:pPr>
       <w:r>
         <w:rPr>
-          <w:rFonts w:ascii="Times New Roman" w:hAnsi="Times New Roman"/>
+          <w:rFonts w:ascii="Cambria Math" w:hAnsi="Cambria Math"/>
           <w:b w:val="0"/>
           <w:i/>
-          <w:sz w:val="22"/>
-          <w:rFonts w:ascii="Times New Roman" w:hAnsi="Times New Roman" w:eastAsia="Times New Roman"/>
-        </w:rPr>
-        <w:t>\alpha_r = \min(\mu_{A_r}(x), \mu_{B_r}(y))</w:t>
+          <w:color w:val="101828"/>
+          <w:sz w:val="23"/>
+          <w:rFonts w:ascii="Cambria Math" w:hAnsi="Cambria Math" w:eastAsia="Cambria Math"/>
+        </w:rPr>
+        <w:t>α_r = min(μ_{A_r}(x), μ_{B_r}(y))</w:t>
       </w:r>
     </w:p>
     <w:p>
@@ -2038,18 +2685,19 @@
     </w:p>
     <w:p>
       <w:pPr>
-        <w:spacing w:before="80" w:after="80"/>
+        <w:spacing w:before="100" w:after="100"/>
         <w:jc w:val="center"/>
       </w:pPr>
       <w:r>
         <w:rPr>
-          <w:rFonts w:ascii="Times New Roman" w:hAnsi="Times New Roman"/>
+          <w:rFonts w:ascii="Cambria Math" w:hAnsi="Cambria Math"/>
           <w:b w:val="0"/>
           <w:i/>
-          <w:sz w:val="22"/>
-          <w:rFonts w:ascii="Times New Roman" w:hAnsi="Times New Roman" w:eastAsia="Times New Roman"/>
-        </w:rPr>
-        <w:t>\mu_{\text{agg}}(z) = \max_r \left( \min(\alpha_r, \mu_{C_r}(z)) \right)</w:t>
+          <w:color w:val="101828"/>
+          <w:sz w:val="23"/>
+          <w:rFonts w:ascii="Cambria Math" w:hAnsi="Cambria Math" w:eastAsia="Cambria Math"/>
+        </w:rPr>
+        <w:t>μ_{agg}(z) = max_r ( min(α_r, μ_{C_r}(z)) )</w:t>
       </w:r>
     </w:p>
     <w:p>
@@ -2137,18 +2785,19 @@
     </w:p>
     <w:p>
       <w:pPr>
-        <w:spacing w:before="80" w:after="80"/>
+        <w:spacing w:before="100" w:after="100"/>
         <w:jc w:val="center"/>
       </w:pPr>
       <w:r>
         <w:rPr>
-          <w:rFonts w:ascii="Times New Roman" w:hAnsi="Times New Roman"/>
+          <w:rFonts w:ascii="Cambria Math" w:hAnsi="Cambria Math"/>
           <w:b w:val="0"/>
           <w:i/>
-          <w:sz w:val="22"/>
-          <w:rFonts w:ascii="Times New Roman" w:hAnsi="Times New Roman" w:eastAsia="Times New Roman"/>
-        </w:rPr>
-        <w:t>z^* = \frac{\int z \cdot \mu_{\text{agg}}(z) \, dz}{\int \mu_{\text{agg}}(z) \, dz} \approx \frac{\sum_{i=1}^M z_i \cdot \mu_{\text{agg}}(z_i)}{\sum_{i=1}^M \mu_{\text{agg}}(z_i)}</w:t>
+          <w:color w:val="101828"/>
+          <w:sz w:val="23"/>
+          <w:rFonts w:ascii="Cambria Math" w:hAnsi="Cambria Math" w:eastAsia="Cambria Math"/>
+        </w:rPr>
+        <w:t>z^* = {∫ z · μ_{agg}(z)   dz}{∫ μ_{agg}(z)   dz} ≈ {∑_{i=1}^M z_i · μ_{agg}(z_i)}{∑_{i=1}^M μ_{agg}(z_i)}</w:t>
       </w:r>
     </w:p>
     <w:p>
@@ -2315,13 +2964,14 @@
     </w:p>
     <w:p>
       <w:pPr>
-        <w:spacing w:before="160" w:after="40"/>
+        <w:keepNext/>
+        <w:spacing w:before="200" w:after="40"/>
         <w:jc w:val="center"/>
       </w:pPr>
       <w:r>
         <w:drawing>
           <wp:inline xmlns:a="http://schemas.openxmlformats.org/drawingml/2006/main" xmlns:pic="http://schemas.openxmlformats.org/drawingml/2006/picture">
-            <wp:extent cx="5303520" cy="3465666"/>
+            <wp:extent cx="5212080" cy="3091503"/>
             <wp:docPr id="1" name="Picture 1"/>
             <wp:cNvGraphicFramePr>
               <a:graphicFrameLocks noChangeAspect="1"/>
@@ -2342,7 +2992,7 @@
                   <pic:spPr>
                     <a:xfrm>
                       <a:off x="0" y="0"/>
-                      <a:ext cx="5303520" cy="3465666"/>
+                      <a:ext cx="5212080" cy="3091503"/>
                     </a:xfrm>
                     <a:prstGeom prst="rect"/>
                   </pic:spPr>
@@ -2355,8 +3005,7 @@
     </w:p>
     <w:p>
       <w:pPr>
-        <w:keepNext w:val="0"/>
-        <w:spacing w:before="40" w:after="160"/>
+        <w:spacing w:before="40" w:after="200"/>
         <w:jc w:val="center"/>
       </w:pPr>
       <w:r>
@@ -2402,7 +3051,29 @@
           <w:sz w:val="22"/>
           <w:rFonts w:ascii="Times New Roman" w:hAnsi="Times New Roman" w:eastAsia="宋体"/>
         </w:rPr>
-        <w:t>定义订单论域 $\mathcal{O}$，为支持可解释推理，构建以下核心谓词与产生式规则：</w:t>
+        <w:t xml:space="preserve">定义订单论域 </w:t>
+      </w:r>
+      <w:r>
+        <w:rPr>
+          <w:rFonts w:ascii="Cambria Math" w:hAnsi="Cambria Math"/>
+          <w:b w:val="0"/>
+          <w:i/>
+          <w:color w:val="101828"/>
+          <w:sz w:val="22"/>
+          <w:rFonts w:ascii="Cambria Math" w:hAnsi="Cambria Math" w:eastAsia="Cambria Math"/>
+        </w:rPr>
+        <w:t>O</w:t>
+      </w:r>
+      <w:r>
+        <w:rPr>
+          <w:rFonts w:ascii="Times New Roman" w:hAnsi="Times New Roman"/>
+          <w:b w:val="0"/>
+          <w:i w:val="0"/>
+          <w:color w:val="1D2939"/>
+          <w:sz w:val="22"/>
+          <w:rFonts w:ascii="Times New Roman" w:hAnsi="Times New Roman" w:eastAsia="宋体"/>
+        </w:rPr>
+        <w:t>，为支持可解释推理，构建以下核心谓词与产生式规则：</w:t>
       </w:r>
     </w:p>
     <w:p>
@@ -2436,7 +3107,51 @@
           <w:sz w:val="22"/>
           <w:rFonts w:ascii="Times New Roman" w:hAnsi="Times New Roman" w:eastAsia="宋体"/>
         </w:rPr>
-        <w:t>1. $\text{Delivered}(o)$：订单 $o$ 已经物流签收；</w:t>
+        <w:t xml:space="preserve">1. </w:t>
+      </w:r>
+      <w:r>
+        <w:rPr>
+          <w:rFonts w:ascii="Cambria Math" w:hAnsi="Cambria Math"/>
+          <w:b w:val="0"/>
+          <w:i/>
+          <w:color w:val="101828"/>
+          <w:sz w:val="22"/>
+          <w:rFonts w:ascii="Cambria Math" w:hAnsi="Cambria Math" w:eastAsia="Cambria Math"/>
+        </w:rPr>
+        <w:t>Delivered(o)</w:t>
+      </w:r>
+      <w:r>
+        <w:rPr>
+          <w:rFonts w:ascii="Times New Roman" w:hAnsi="Times New Roman"/>
+          <w:b w:val="0"/>
+          <w:i w:val="0"/>
+          <w:color w:val="1D2939"/>
+          <w:sz w:val="22"/>
+          <w:rFonts w:ascii="Times New Roman" w:hAnsi="Times New Roman" w:eastAsia="宋体"/>
+        </w:rPr>
+        <w:t xml:space="preserve">：订单 </w:t>
+      </w:r>
+      <w:r>
+        <w:rPr>
+          <w:rFonts w:ascii="Cambria Math" w:hAnsi="Cambria Math"/>
+          <w:b w:val="0"/>
+          <w:i/>
+          <w:color w:val="101828"/>
+          <w:sz w:val="22"/>
+          <w:rFonts w:ascii="Cambria Math" w:hAnsi="Cambria Math" w:eastAsia="Cambria Math"/>
+        </w:rPr>
+        <w:t>o</w:t>
+      </w:r>
+      <w:r>
+        <w:rPr>
+          <w:rFonts w:ascii="Times New Roman" w:hAnsi="Times New Roman"/>
+          <w:b w:val="0"/>
+          <w:i w:val="0"/>
+          <w:color w:val="1D2939"/>
+          <w:sz w:val="22"/>
+          <w:rFonts w:ascii="Times New Roman" w:hAnsi="Times New Roman" w:eastAsia="宋体"/>
+        </w:rPr>
+        <w:t xml:space="preserve"> 已经物流签收；</w:t>
       </w:r>
     </w:p>
     <w:p>
@@ -2453,7 +3168,73 @@
           <w:sz w:val="22"/>
           <w:rFonts w:ascii="Times New Roman" w:hAnsi="Times New Roman" w:eastAsia="宋体"/>
         </w:rPr>
-        <w:t>2. $\text{Within168}(o)$：订单 $o$ 签收耗时 $\Delta t \le 168.0$ 小时；</w:t>
+        <w:t xml:space="preserve">2. </w:t>
+      </w:r>
+      <w:r>
+        <w:rPr>
+          <w:rFonts w:ascii="Cambria Math" w:hAnsi="Cambria Math"/>
+          <w:b w:val="0"/>
+          <w:i/>
+          <w:color w:val="101828"/>
+          <w:sz w:val="22"/>
+          <w:rFonts w:ascii="Cambria Math" w:hAnsi="Cambria Math" w:eastAsia="Cambria Math"/>
+        </w:rPr>
+        <w:t>Within168(o)</w:t>
+      </w:r>
+      <w:r>
+        <w:rPr>
+          <w:rFonts w:ascii="Times New Roman" w:hAnsi="Times New Roman"/>
+          <w:b w:val="0"/>
+          <w:i w:val="0"/>
+          <w:color w:val="1D2939"/>
+          <w:sz w:val="22"/>
+          <w:rFonts w:ascii="Times New Roman" w:hAnsi="Times New Roman" w:eastAsia="宋体"/>
+        </w:rPr>
+        <w:t xml:space="preserve">：订单 </w:t>
+      </w:r>
+      <w:r>
+        <w:rPr>
+          <w:rFonts w:ascii="Cambria Math" w:hAnsi="Cambria Math"/>
+          <w:b w:val="0"/>
+          <w:i/>
+          <w:color w:val="101828"/>
+          <w:sz w:val="22"/>
+          <w:rFonts w:ascii="Cambria Math" w:hAnsi="Cambria Math" w:eastAsia="Cambria Math"/>
+        </w:rPr>
+        <w:t>o</w:t>
+      </w:r>
+      <w:r>
+        <w:rPr>
+          <w:rFonts w:ascii="Times New Roman" w:hAnsi="Times New Roman"/>
+          <w:b w:val="0"/>
+          <w:i w:val="0"/>
+          <w:color w:val="1D2939"/>
+          <w:sz w:val="22"/>
+          <w:rFonts w:ascii="Times New Roman" w:hAnsi="Times New Roman" w:eastAsia="宋体"/>
+        </w:rPr>
+        <w:t xml:space="preserve"> 签收耗时 </w:t>
+      </w:r>
+      <w:r>
+        <w:rPr>
+          <w:rFonts w:ascii="Cambria Math" w:hAnsi="Cambria Math"/>
+          <w:b w:val="0"/>
+          <w:i/>
+          <w:color w:val="101828"/>
+          <w:sz w:val="22"/>
+          <w:rFonts w:ascii="Cambria Math" w:hAnsi="Cambria Math" w:eastAsia="Cambria Math"/>
+        </w:rPr>
+        <w:t>Δ t ≤ 168.0</w:t>
+      </w:r>
+      <w:r>
+        <w:rPr>
+          <w:rFonts w:ascii="Times New Roman" w:hAnsi="Times New Roman"/>
+          <w:b w:val="0"/>
+          <w:i w:val="0"/>
+          <w:color w:val="1D2939"/>
+          <w:sz w:val="22"/>
+          <w:rFonts w:ascii="Times New Roman" w:hAnsi="Times New Roman" w:eastAsia="宋体"/>
+        </w:rPr>
+        <w:t xml:space="preserve"> 小时；</w:t>
       </w:r>
     </w:p>
     <w:p>
@@ -2470,7 +3251,51 @@
           <w:sz w:val="22"/>
           <w:rFonts w:ascii="Times New Roman" w:hAnsi="Times New Roman" w:eastAsia="宋体"/>
         </w:rPr>
-        <w:t>3. $\text{Unopened}(o)$：商品完好未拆封（$\text{is\_opened} = \text{false}$）；</w:t>
+        <w:t xml:space="preserve">3. </w:t>
+      </w:r>
+      <w:r>
+        <w:rPr>
+          <w:rFonts w:ascii="Cambria Math" w:hAnsi="Cambria Math"/>
+          <w:b w:val="0"/>
+          <w:i/>
+          <w:color w:val="101828"/>
+          <w:sz w:val="22"/>
+          <w:rFonts w:ascii="Cambria Math" w:hAnsi="Cambria Math" w:eastAsia="Cambria Math"/>
+        </w:rPr>
+        <w:t>Unopened(o)</w:t>
+      </w:r>
+      <w:r>
+        <w:rPr>
+          <w:rFonts w:ascii="Times New Roman" w:hAnsi="Times New Roman"/>
+          <w:b w:val="0"/>
+          <w:i w:val="0"/>
+          <w:color w:val="1D2939"/>
+          <w:sz w:val="22"/>
+          <w:rFonts w:ascii="Times New Roman" w:hAnsi="Times New Roman" w:eastAsia="宋体"/>
+        </w:rPr>
+        <w:t>：商品完好未拆封（</w:t>
+      </w:r>
+      <w:r>
+        <w:rPr>
+          <w:rFonts w:ascii="Cambria Math" w:hAnsi="Cambria Math"/>
+          <w:b w:val="0"/>
+          <w:i/>
+          <w:color w:val="101828"/>
+          <w:sz w:val="22"/>
+          <w:rFonts w:ascii="Cambria Math" w:hAnsi="Cambria Math" w:eastAsia="Cambria Math"/>
+        </w:rPr>
+        <w:t>is_opened = false</w:t>
+      </w:r>
+      <w:r>
+        <w:rPr>
+          <w:rFonts w:ascii="Times New Roman" w:hAnsi="Times New Roman"/>
+          <w:b w:val="0"/>
+          <w:i w:val="0"/>
+          <w:color w:val="1D2939"/>
+          <w:sz w:val="22"/>
+          <w:rFonts w:ascii="Times New Roman" w:hAnsi="Times New Roman" w:eastAsia="宋体"/>
+        </w:rPr>
+        <w:t>）；</w:t>
       </w:r>
     </w:p>
     <w:p>
@@ -2487,7 +3312,29 @@
           <w:sz w:val="22"/>
           <w:rFonts w:ascii="Times New Roman" w:hAnsi="Times New Roman" w:eastAsia="宋体"/>
         </w:rPr>
-        <w:t>4. $\text{HasInsurance}(o)$：订单享有运费险补贴；</w:t>
+        <w:t xml:space="preserve">4. </w:t>
+      </w:r>
+      <w:r>
+        <w:rPr>
+          <w:rFonts w:ascii="Cambria Math" w:hAnsi="Cambria Math"/>
+          <w:b w:val="0"/>
+          <w:i/>
+          <w:color w:val="101828"/>
+          <w:sz w:val="22"/>
+          <w:rFonts w:ascii="Cambria Math" w:hAnsi="Cambria Math" w:eastAsia="Cambria Math"/>
+        </w:rPr>
+        <w:t>HasInsurance(o)</w:t>
+      </w:r>
+      <w:r>
+        <w:rPr>
+          <w:rFonts w:ascii="Times New Roman" w:hAnsi="Times New Roman"/>
+          <w:b w:val="0"/>
+          <w:i w:val="0"/>
+          <w:color w:val="1D2939"/>
+          <w:sz w:val="22"/>
+          <w:rFonts w:ascii="Times New Roman" w:hAnsi="Times New Roman" w:eastAsia="宋体"/>
+        </w:rPr>
+        <w:t>：订单享有运费险补贴；</w:t>
       </w:r>
     </w:p>
     <w:p>
@@ -2504,7 +3351,51 @@
           <w:sz w:val="22"/>
           <w:rFonts w:ascii="Times New Roman" w:hAnsi="Times New Roman" w:eastAsia="宋体"/>
         </w:rPr>
-        <w:t>5. $\text{MicroOverdue}(o)$：微量超期区间，即 $168.0 &lt; \Delta t \le 216.0$ 小时；</w:t>
+        <w:t xml:space="preserve">5. </w:t>
+      </w:r>
+      <w:r>
+        <w:rPr>
+          <w:rFonts w:ascii="Cambria Math" w:hAnsi="Cambria Math"/>
+          <w:b w:val="0"/>
+          <w:i/>
+          <w:color w:val="101828"/>
+          <w:sz w:val="22"/>
+          <w:rFonts w:ascii="Cambria Math" w:hAnsi="Cambria Math" w:eastAsia="Cambria Math"/>
+        </w:rPr>
+        <w:t>MicroOverdue(o)</w:t>
+      </w:r>
+      <w:r>
+        <w:rPr>
+          <w:rFonts w:ascii="Times New Roman" w:hAnsi="Times New Roman"/>
+          <w:b w:val="0"/>
+          <w:i w:val="0"/>
+          <w:color w:val="1D2939"/>
+          <w:sz w:val="22"/>
+          <w:rFonts w:ascii="Times New Roman" w:hAnsi="Times New Roman" w:eastAsia="宋体"/>
+        </w:rPr>
+        <w:t xml:space="preserve">：微量超期区间，即 </w:t>
+      </w:r>
+      <w:r>
+        <w:rPr>
+          <w:rFonts w:ascii="Cambria Math" w:hAnsi="Cambria Math"/>
+          <w:b w:val="0"/>
+          <w:i/>
+          <w:color w:val="101828"/>
+          <w:sz w:val="22"/>
+          <w:rFonts w:ascii="Cambria Math" w:hAnsi="Cambria Math" w:eastAsia="Cambria Math"/>
+        </w:rPr>
+        <w:t>168.0 &lt; Δ t ≤ 216.0</w:t>
+      </w:r>
+      <w:r>
+        <w:rPr>
+          <w:rFonts w:ascii="Times New Roman" w:hAnsi="Times New Roman"/>
+          <w:b w:val="0"/>
+          <w:i w:val="0"/>
+          <w:color w:val="1D2939"/>
+          <w:sz w:val="22"/>
+          <w:rFonts w:ascii="Times New Roman" w:hAnsi="Times New Roman" w:eastAsia="宋体"/>
+        </w:rPr>
+        <w:t xml:space="preserve"> 小时；</w:t>
       </w:r>
     </w:p>
     <w:p>
@@ -2521,7 +3412,51 @@
           <w:sz w:val="22"/>
           <w:rFonts w:ascii="Times New Roman" w:hAnsi="Times New Roman" w:eastAsia="宋体"/>
         </w:rPr>
-        <w:t>6. $\text{HighCredit}(o)$：买家历史信誉评分 $\ge 90.0$；</w:t>
+        <w:t xml:space="preserve">6. </w:t>
+      </w:r>
+      <w:r>
+        <w:rPr>
+          <w:rFonts w:ascii="Cambria Math" w:hAnsi="Cambria Math"/>
+          <w:b w:val="0"/>
+          <w:i/>
+          <w:color w:val="101828"/>
+          <w:sz w:val="22"/>
+          <w:rFonts w:ascii="Cambria Math" w:hAnsi="Cambria Math" w:eastAsia="Cambria Math"/>
+        </w:rPr>
+        <w:t>HighCredit(o)</w:t>
+      </w:r>
+      <w:r>
+        <w:rPr>
+          <w:rFonts w:ascii="Times New Roman" w:hAnsi="Times New Roman"/>
+          <w:b w:val="0"/>
+          <w:i w:val="0"/>
+          <w:color w:val="1D2939"/>
+          <w:sz w:val="22"/>
+          <w:rFonts w:ascii="Times New Roman" w:hAnsi="Times New Roman" w:eastAsia="宋体"/>
+        </w:rPr>
+        <w:t xml:space="preserve">：买家历史信誉评分 </w:t>
+      </w:r>
+      <w:r>
+        <w:rPr>
+          <w:rFonts w:ascii="Cambria Math" w:hAnsi="Cambria Math"/>
+          <w:b w:val="0"/>
+          <w:i/>
+          <w:color w:val="101828"/>
+          <w:sz w:val="22"/>
+          <w:rFonts w:ascii="Cambria Math" w:hAnsi="Cambria Math" w:eastAsia="Cambria Math"/>
+        </w:rPr>
+        <w:t>≥ 90.0</w:t>
+      </w:r>
+      <w:r>
+        <w:rPr>
+          <w:rFonts w:ascii="Times New Roman" w:hAnsi="Times New Roman"/>
+          <w:b w:val="0"/>
+          <w:i w:val="0"/>
+          <w:color w:val="1D2939"/>
+          <w:sz w:val="22"/>
+          <w:rFonts w:ascii="Times New Roman" w:hAnsi="Times New Roman" w:eastAsia="宋体"/>
+        </w:rPr>
+        <w:t>；</w:t>
       </w:r>
     </w:p>
     <w:p>
@@ -2538,7 +3473,29 @@
           <w:sz w:val="22"/>
           <w:rFonts w:ascii="Times New Roman" w:hAnsi="Times New Roman" w:eastAsia="宋体"/>
         </w:rPr>
-        <w:t>7. $\text{ReturnEligible}(o)$：满足常规 7 天无理由退货资格；</w:t>
+        <w:t xml:space="preserve">7. </w:t>
+      </w:r>
+      <w:r>
+        <w:rPr>
+          <w:rFonts w:ascii="Cambria Math" w:hAnsi="Cambria Math"/>
+          <w:b w:val="0"/>
+          <w:i/>
+          <w:color w:val="101828"/>
+          <w:sz w:val="22"/>
+          <w:rFonts w:ascii="Cambria Math" w:hAnsi="Cambria Math" w:eastAsia="Cambria Math"/>
+        </w:rPr>
+        <w:t>ReturnEligible(o)</w:t>
+      </w:r>
+      <w:r>
+        <w:rPr>
+          <w:rFonts w:ascii="Times New Roman" w:hAnsi="Times New Roman"/>
+          <w:b w:val="0"/>
+          <w:i w:val="0"/>
+          <w:color w:val="1D2939"/>
+          <w:sz w:val="22"/>
+          <w:rFonts w:ascii="Times New Roman" w:hAnsi="Times New Roman" w:eastAsia="宋体"/>
+        </w:rPr>
+        <w:t>：满足常规 7 天无理由退货资格；</w:t>
       </w:r>
     </w:p>
     <w:p>
@@ -2555,7 +3512,29 @@
           <w:sz w:val="22"/>
           <w:rFonts w:ascii="Times New Roman" w:hAnsi="Times New Roman" w:eastAsia="宋体"/>
         </w:rPr>
-        <w:t>8. $\text{SpecialApproved}(o)$：满足双轨特批退换资格；</w:t>
+        <w:t xml:space="preserve">8. </w:t>
+      </w:r>
+      <w:r>
+        <w:rPr>
+          <w:rFonts w:ascii="Cambria Math" w:hAnsi="Cambria Math"/>
+          <w:b w:val="0"/>
+          <w:i/>
+          <w:color w:val="101828"/>
+          <w:sz w:val="22"/>
+          <w:rFonts w:ascii="Cambria Math" w:hAnsi="Cambria Math" w:eastAsia="Cambria Math"/>
+        </w:rPr>
+        <w:t>SpecialApproved(o)</w:t>
+      </w:r>
+      <w:r>
+        <w:rPr>
+          <w:rFonts w:ascii="Times New Roman" w:hAnsi="Times New Roman"/>
+          <w:b w:val="0"/>
+          <w:i w:val="0"/>
+          <w:color w:val="1D2939"/>
+          <w:sz w:val="22"/>
+          <w:rFonts w:ascii="Times New Roman" w:hAnsi="Times New Roman" w:eastAsia="宋体"/>
+        </w:rPr>
+        <w:t>：满足双轨特批退换资格；</w:t>
       </w:r>
     </w:p>
     <w:p>
@@ -2572,7 +3551,29 @@
           <w:sz w:val="22"/>
           <w:rFonts w:ascii="Times New Roman" w:hAnsi="Times New Roman" w:eastAsia="宋体"/>
         </w:rPr>
-        <w:t>9. $\text{HardReject}(o)$：命中一票否决黑名单。</w:t>
+        <w:t xml:space="preserve">9. </w:t>
+      </w:r>
+      <w:r>
+        <w:rPr>
+          <w:rFonts w:ascii="Cambria Math" w:hAnsi="Cambria Math"/>
+          <w:b w:val="0"/>
+          <w:i/>
+          <w:color w:val="101828"/>
+          <w:sz w:val="22"/>
+          <w:rFonts w:ascii="Cambria Math" w:hAnsi="Cambria Math" w:eastAsia="Cambria Math"/>
+        </w:rPr>
+        <w:t>HardReject(o)</w:t>
+      </w:r>
+      <w:r>
+        <w:rPr>
+          <w:rFonts w:ascii="Times New Roman" w:hAnsi="Times New Roman"/>
+          <w:b w:val="0"/>
+          <w:i w:val="0"/>
+          <w:color w:val="1D2939"/>
+          <w:sz w:val="22"/>
+          <w:rFonts w:ascii="Times New Roman" w:hAnsi="Times New Roman" w:eastAsia="宋体"/>
+        </w:rPr>
+        <w:t>：命中一票否决黑名单。</w:t>
       </w:r>
     </w:p>
     <w:p>
@@ -2594,66 +3595,70 @@
     </w:p>
     <w:p>
       <w:pPr>
-        <w:spacing w:before="80" w:after="80"/>
+        <w:spacing w:before="100" w:after="100"/>
         <w:jc w:val="center"/>
       </w:pPr>
       <w:r>
         <w:rPr>
-          <w:rFonts w:ascii="Times New Roman" w:hAnsi="Times New Roman"/>
+          <w:rFonts w:ascii="Cambria Math" w:hAnsi="Cambria Math"/>
           <w:b w:val="0"/>
           <w:i/>
-          <w:sz w:val="22"/>
-          <w:rFonts w:ascii="Times New Roman" w:hAnsi="Times New Roman" w:eastAsia="Times New Roman"/>
-        </w:rPr>
-        <w:t>\text{RULE-AFTER-001: } \forall o \in \mathcal{O}, \text{Delivered}(o) \wedge \text{Within168}(o) \wedge \text{Unopened}(o) \Rightarrow \text{ReturnEligible}(o)</w:t>
+          <w:color w:val="101828"/>
+          <w:sz w:val="23"/>
+          <w:rFonts w:ascii="Cambria Math" w:hAnsi="Cambria Math" w:eastAsia="Cambria Math"/>
+        </w:rPr>
+        <w:t>RULE-AFTER-001:  ∀ o ∈ O, Delivered(o) ∧ Within168(o) ∧ Unopened(o) ⇒ ReturnEligible(o)</w:t>
       </w:r>
     </w:p>
     <w:p>
       <w:pPr>
-        <w:spacing w:before="80" w:after="80"/>
+        <w:spacing w:before="100" w:after="100"/>
         <w:jc w:val="center"/>
       </w:pPr>
       <w:r>
         <w:rPr>
-          <w:rFonts w:ascii="Times New Roman" w:hAnsi="Times New Roman"/>
+          <w:rFonts w:ascii="Cambria Math" w:hAnsi="Cambria Math"/>
           <w:b w:val="0"/>
           <w:i/>
-          <w:sz w:val="22"/>
-          <w:rFonts w:ascii="Times New Roman" w:hAnsi="Times New Roman" w:eastAsia="Times New Roman"/>
-        </w:rPr>
-        <w:t>\text{RULE-AFTER-002: } \forall o \in \mathcal{O}, \text{ReturnEligible}(o) \wedge \text{HasInsurance}(o) \Rightarrow \text{FreeReturnShipping}(o)</w:t>
+          <w:color w:val="101828"/>
+          <w:sz w:val="23"/>
+          <w:rFonts w:ascii="Cambria Math" w:hAnsi="Cambria Math" w:eastAsia="Cambria Math"/>
+        </w:rPr>
+        <w:t>RULE-AFTER-002:  ∀ o ∈ O, ReturnEligible(o) ∧ HasInsurance(o) ⇒ FreeReturnShipping(o)</w:t>
       </w:r>
     </w:p>
     <w:p>
       <w:pPr>
-        <w:spacing w:before="80" w:after="80"/>
+        <w:spacing w:before="100" w:after="100"/>
         <w:jc w:val="center"/>
       </w:pPr>
       <w:r>
         <w:rPr>
-          <w:rFonts w:ascii="Times New Roman" w:hAnsi="Times New Roman"/>
+          <w:rFonts w:ascii="Cambria Math" w:hAnsi="Cambria Math"/>
           <w:b w:val="0"/>
           <w:i/>
-          <w:sz w:val="22"/>
-          <w:rFonts w:ascii="Times New Roman" w:hAnsi="Times New Roman" w:eastAsia="Times New Roman"/>
-        </w:rPr>
-        <w:t>\text{RULE-AFTER-003: } \forall o \in \mathcal{O}, \neg \text{Unopened}(o) \Rightarrow \text{HardReject}(o) \quad [\text{Priority} = 100]</w:t>
+          <w:color w:val="101828"/>
+          <w:sz w:val="23"/>
+          <w:rFonts w:ascii="Cambria Math" w:hAnsi="Cambria Math" w:eastAsia="Cambria Math"/>
+        </w:rPr>
+        <w:t>RULE-AFTER-003:  ∀ o ∈ O, ¬ Unopened(o) ⇒ HardReject(o)    [Priority = 100]</w:t>
       </w:r>
     </w:p>
     <w:p>
       <w:pPr>
-        <w:spacing w:before="80" w:after="80"/>
+        <w:spacing w:before="100" w:after="100"/>
         <w:jc w:val="center"/>
       </w:pPr>
       <w:r>
         <w:rPr>
-          <w:rFonts w:ascii="Times New Roman" w:hAnsi="Times New Roman"/>
+          <w:rFonts w:ascii="Cambria Math" w:hAnsi="Cambria Math"/>
           <w:b w:val="0"/>
           <w:i/>
-          <w:sz w:val="22"/>
-          <w:rFonts w:ascii="Times New Roman" w:hAnsi="Times New Roman" w:eastAsia="Times New Roman"/>
-        </w:rPr>
-        <w:t>\text{RULE-AFTER-004: } \forall o \in \mathcal{O}, \text{Delivered}(o) \wedge \text{MicroOverdue}(o) \wedge \text{Unopened}(o) \Rightarrow \text{EscalateToArbitration}(o)</w:t>
+          <w:color w:val="101828"/>
+          <w:sz w:val="23"/>
+          <w:rFonts w:ascii="Cambria Math" w:hAnsi="Cambria Math" w:eastAsia="Cambria Math"/>
+        </w:rPr>
+        <w:t>RULE-AFTER-004:  ∀ o ∈ O, Delivered(o) ∧ MicroOverdue(o) ∧ Unopened(o) ⇒ EscalateToArbitration(o)</w:t>
       </w:r>
     </w:p>
     <w:p>
@@ -2714,18 +3719,19 @@
     </w:p>
     <w:p>
       <w:pPr>
-        <w:spacing w:before="80" w:after="80"/>
+        <w:spacing w:before="100" w:after="100"/>
         <w:jc w:val="center"/>
       </w:pPr>
       <w:r>
         <w:rPr>
-          <w:rFonts w:ascii="Times New Roman" w:hAnsi="Times New Roman"/>
+          <w:rFonts w:ascii="Cambria Math" w:hAnsi="Cambria Math"/>
           <w:b w:val="0"/>
           <w:i/>
-          <w:sz w:val="22"/>
-          <w:rFonts w:ascii="Times New Roman" w:hAnsi="Times New Roman" w:eastAsia="Times New Roman"/>
-        </w:rPr>
-        <w:t>\Theta = \{B, S, L\}</w:t>
+          <w:color w:val="101828"/>
+          <w:sz w:val="23"/>
+          <w:rFonts w:ascii="Cambria Math" w:hAnsi="Cambria Math" w:eastAsia="Cambria Math"/>
+        </w:rPr>
+        <w:t>Θ = {B, S, L}</w:t>
       </w:r>
     </w:p>
     <w:p>
@@ -2742,7 +3748,73 @@
           <w:sz w:val="22"/>
           <w:rFonts w:ascii="Times New Roman" w:hAnsi="Times New Roman" w:eastAsia="宋体"/>
         </w:rPr>
-        <w:t>其中 $B$ 代表买家责任（Buyer），$S$ 代表商家责任（Seller），$L$ 代表物流公司责任（Logistics）。</w:t>
+        <w:t xml:space="preserve">其中 </w:t>
+      </w:r>
+      <w:r>
+        <w:rPr>
+          <w:rFonts w:ascii="Cambria Math" w:hAnsi="Cambria Math"/>
+          <w:b w:val="0"/>
+          <w:i/>
+          <w:color w:val="101828"/>
+          <w:sz w:val="22"/>
+          <w:rFonts w:ascii="Cambria Math" w:hAnsi="Cambria Math" w:eastAsia="Cambria Math"/>
+        </w:rPr>
+        <w:t>B</w:t>
+      </w:r>
+      <w:r>
+        <w:rPr>
+          <w:rFonts w:ascii="Times New Roman" w:hAnsi="Times New Roman"/>
+          <w:b w:val="0"/>
+          <w:i w:val="0"/>
+          <w:color w:val="1D2939"/>
+          <w:sz w:val="22"/>
+          <w:rFonts w:ascii="Times New Roman" w:hAnsi="Times New Roman" w:eastAsia="宋体"/>
+        </w:rPr>
+        <w:t xml:space="preserve"> 代表买家责任（Buyer），</w:t>
+      </w:r>
+      <w:r>
+        <w:rPr>
+          <w:rFonts w:ascii="Cambria Math" w:hAnsi="Cambria Math"/>
+          <w:b w:val="0"/>
+          <w:i/>
+          <w:color w:val="101828"/>
+          <w:sz w:val="22"/>
+          <w:rFonts w:ascii="Cambria Math" w:hAnsi="Cambria Math" w:eastAsia="Cambria Math"/>
+        </w:rPr>
+        <w:t>S</w:t>
+      </w:r>
+      <w:r>
+        <w:rPr>
+          <w:rFonts w:ascii="Times New Roman" w:hAnsi="Times New Roman"/>
+          <w:b w:val="0"/>
+          <w:i w:val="0"/>
+          <w:color w:val="1D2939"/>
+          <w:sz w:val="22"/>
+          <w:rFonts w:ascii="Times New Roman" w:hAnsi="Times New Roman" w:eastAsia="宋体"/>
+        </w:rPr>
+        <w:t xml:space="preserve"> 代表商家责任（Seller），</w:t>
+      </w:r>
+      <w:r>
+        <w:rPr>
+          <w:rFonts w:ascii="Cambria Math" w:hAnsi="Cambria Math"/>
+          <w:b w:val="0"/>
+          <w:i/>
+          <w:color w:val="101828"/>
+          <w:sz w:val="22"/>
+          <w:rFonts w:ascii="Cambria Math" w:hAnsi="Cambria Math" w:eastAsia="Cambria Math"/>
+        </w:rPr>
+        <w:t>L</w:t>
+      </w:r>
+      <w:r>
+        <w:rPr>
+          <w:rFonts w:ascii="Times New Roman" w:hAnsi="Times New Roman"/>
+          <w:b w:val="0"/>
+          <w:i w:val="0"/>
+          <w:color w:val="1D2939"/>
+          <w:sz w:val="22"/>
+          <w:rFonts w:ascii="Times New Roman" w:hAnsi="Times New Roman" w:eastAsia="宋体"/>
+        </w:rPr>
+        <w:t xml:space="preserve"> 代表物流公司责任（Logistics）。</w:t>
       </w:r>
     </w:p>
     <w:p>
@@ -2804,7 +3876,73 @@
           <w:sz w:val="22"/>
           <w:rFonts w:ascii="Times New Roman" w:hAnsi="Times New Roman" w:eastAsia="宋体"/>
         </w:rPr>
-        <w:t>- 监测物流颠簸冲击加速度 $g$。当 $g &gt; 0.85$ 时，大幅分配置信度给物流方责任 $L$；</w:t>
+        <w:t xml:space="preserve">- 监测物流颠簸冲击加速度 </w:t>
+      </w:r>
+      <w:r>
+        <w:rPr>
+          <w:rFonts w:ascii="Cambria Math" w:hAnsi="Cambria Math"/>
+          <w:b w:val="0"/>
+          <w:i/>
+          <w:color w:val="101828"/>
+          <w:sz w:val="22"/>
+          <w:rFonts w:ascii="Cambria Math" w:hAnsi="Cambria Math" w:eastAsia="Cambria Math"/>
+        </w:rPr>
+        <w:t>g</w:t>
+      </w:r>
+      <w:r>
+        <w:rPr>
+          <w:rFonts w:ascii="Times New Roman" w:hAnsi="Times New Roman"/>
+          <w:b w:val="0"/>
+          <w:i w:val="0"/>
+          <w:color w:val="1D2939"/>
+          <w:sz w:val="22"/>
+          <w:rFonts w:ascii="Times New Roman" w:hAnsi="Times New Roman" w:eastAsia="宋体"/>
+        </w:rPr>
+        <w:t xml:space="preserve">。当 </w:t>
+      </w:r>
+      <w:r>
+        <w:rPr>
+          <w:rFonts w:ascii="Cambria Math" w:hAnsi="Cambria Math"/>
+          <w:b w:val="0"/>
+          <w:i/>
+          <w:color w:val="101828"/>
+          <w:sz w:val="22"/>
+          <w:rFonts w:ascii="Cambria Math" w:hAnsi="Cambria Math" w:eastAsia="Cambria Math"/>
+        </w:rPr>
+        <w:t>g &gt; 0.85</w:t>
+      </w:r>
+      <w:r>
+        <w:rPr>
+          <w:rFonts w:ascii="Times New Roman" w:hAnsi="Times New Roman"/>
+          <w:b w:val="0"/>
+          <w:i w:val="0"/>
+          <w:color w:val="1D2939"/>
+          <w:sz w:val="22"/>
+          <w:rFonts w:ascii="Times New Roman" w:hAnsi="Times New Roman" w:eastAsia="宋体"/>
+        </w:rPr>
+        <w:t xml:space="preserve"> 时，大幅分配置信度给物流方责任 </w:t>
+      </w:r>
+      <w:r>
+        <w:rPr>
+          <w:rFonts w:ascii="Cambria Math" w:hAnsi="Cambria Math"/>
+          <w:b w:val="0"/>
+          <w:i/>
+          <w:color w:val="101828"/>
+          <w:sz w:val="22"/>
+          <w:rFonts w:ascii="Cambria Math" w:hAnsi="Cambria Math" w:eastAsia="Cambria Math"/>
+        </w:rPr>
+        <w:t>L</w:t>
+      </w:r>
+      <w:r>
+        <w:rPr>
+          <w:rFonts w:ascii="Times New Roman" w:hAnsi="Times New Roman"/>
+          <w:b w:val="0"/>
+          <w:i w:val="0"/>
+          <w:color w:val="1D2939"/>
+          <w:sz w:val="22"/>
+          <w:rFonts w:ascii="Times New Roman" w:hAnsi="Times New Roman" w:eastAsia="宋体"/>
+        </w:rPr>
+        <w:t>；</w:t>
       </w:r>
     </w:p>
     <w:p>
@@ -2849,7 +3987,51 @@
           <w:sz w:val="22"/>
           <w:rFonts w:ascii="Times New Roman" w:hAnsi="Times New Roman" w:eastAsia="宋体"/>
         </w:rPr>
-        <w:t>- 对商家出库图像与买家开箱图像进行配准检测，输出瑕疵置信度 $c_{\text{defect}}$；若瑕疵在出库图即存在，大幅分配给商家 $S$；</w:t>
+        <w:t xml:space="preserve">- 对商家出库图像与买家开箱图像进行配准检测，输出瑕疵置信度 </w:t>
+      </w:r>
+      <w:r>
+        <w:rPr>
+          <w:rFonts w:ascii="Cambria Math" w:hAnsi="Cambria Math"/>
+          <w:b w:val="0"/>
+          <w:i/>
+          <w:color w:val="101828"/>
+          <w:sz w:val="22"/>
+          <w:rFonts w:ascii="Cambria Math" w:hAnsi="Cambria Math" w:eastAsia="Cambria Math"/>
+        </w:rPr>
+        <w:t>c_{defect}</w:t>
+      </w:r>
+      <w:r>
+        <w:rPr>
+          <w:rFonts w:ascii="Times New Roman" w:hAnsi="Times New Roman"/>
+          <w:b w:val="0"/>
+          <w:i w:val="0"/>
+          <w:color w:val="1D2939"/>
+          <w:sz w:val="22"/>
+          <w:rFonts w:ascii="Times New Roman" w:hAnsi="Times New Roman" w:eastAsia="宋体"/>
+        </w:rPr>
+        <w:t xml:space="preserve">；若瑕疵在出库图即存在，大幅分配给商家 </w:t>
+      </w:r>
+      <w:r>
+        <w:rPr>
+          <w:rFonts w:ascii="Cambria Math" w:hAnsi="Cambria Math"/>
+          <w:b w:val="0"/>
+          <w:i/>
+          <w:color w:val="101828"/>
+          <w:sz w:val="22"/>
+          <w:rFonts w:ascii="Cambria Math" w:hAnsi="Cambria Math" w:eastAsia="Cambria Math"/>
+        </w:rPr>
+        <w:t>S</w:t>
+      </w:r>
+      <w:r>
+        <w:rPr>
+          <w:rFonts w:ascii="Times New Roman" w:hAnsi="Times New Roman"/>
+          <w:b w:val="0"/>
+          <w:i w:val="0"/>
+          <w:color w:val="1D2939"/>
+          <w:sz w:val="22"/>
+          <w:rFonts w:ascii="Times New Roman" w:hAnsi="Times New Roman" w:eastAsia="宋体"/>
+        </w:rPr>
+        <w:t>；</w:t>
       </w:r>
     </w:p>
     <w:p>
@@ -2894,7 +4076,29 @@
           <w:sz w:val="22"/>
           <w:rFonts w:ascii="Times New Roman" w:hAnsi="Times New Roman" w:eastAsia="宋体"/>
         </w:rPr>
-        <w:t>- 若买家具有高退货率或异常频次记录，向买家责任 $B$ 分配基础概率。</w:t>
+        <w:t xml:space="preserve">- 若买家具有高退货率或异常频次记录，向买家责任 </w:t>
+      </w:r>
+      <w:r>
+        <w:rPr>
+          <w:rFonts w:ascii="Cambria Math" w:hAnsi="Cambria Math"/>
+          <w:b w:val="0"/>
+          <w:i/>
+          <w:color w:val="101828"/>
+          <w:sz w:val="22"/>
+          <w:rFonts w:ascii="Cambria Math" w:hAnsi="Cambria Math" w:eastAsia="Cambria Math"/>
+        </w:rPr>
+        <w:t>B</w:t>
+      </w:r>
+      <w:r>
+        <w:rPr>
+          <w:rFonts w:ascii="Times New Roman" w:hAnsi="Times New Roman"/>
+          <w:b w:val="0"/>
+          <w:i w:val="0"/>
+          <w:color w:val="1D2939"/>
+          <w:sz w:val="22"/>
+          <w:rFonts w:ascii="Times New Roman" w:hAnsi="Times New Roman" w:eastAsia="宋体"/>
+        </w:rPr>
+        <w:t xml:space="preserve"> 分配基础概率。</w:t>
       </w:r>
     </w:p>
     <w:p>
@@ -3063,7 +4267,73 @@
           <w:sz w:val="22"/>
           <w:rFonts w:ascii="Times New Roman" w:hAnsi="Times New Roman" w:eastAsia="宋体"/>
         </w:rPr>
-        <w:t>- 模糊子集：微薄（Low，$[0, 15]$）、中等（Medium，$[10, 35]$）、丰厚（Generous，$[25, 50]$）。</w:t>
+        <w:t>- 模糊子集：微薄（Low，</w:t>
+      </w:r>
+      <w:r>
+        <w:rPr>
+          <w:rFonts w:ascii="Cambria Math" w:hAnsi="Cambria Math"/>
+          <w:b w:val="0"/>
+          <w:i/>
+          <w:color w:val="101828"/>
+          <w:sz w:val="22"/>
+          <w:rFonts w:ascii="Cambria Math" w:hAnsi="Cambria Math" w:eastAsia="Cambria Math"/>
+        </w:rPr>
+        <w:t>[0, 15]</w:t>
+      </w:r>
+      <w:r>
+        <w:rPr>
+          <w:rFonts w:ascii="Times New Roman" w:hAnsi="Times New Roman"/>
+          <w:b w:val="0"/>
+          <w:i w:val="0"/>
+          <w:color w:val="1D2939"/>
+          <w:sz w:val="22"/>
+          <w:rFonts w:ascii="Times New Roman" w:hAnsi="Times New Roman" w:eastAsia="宋体"/>
+        </w:rPr>
+        <w:t>）、中等（Medium，</w:t>
+      </w:r>
+      <w:r>
+        <w:rPr>
+          <w:rFonts w:ascii="Cambria Math" w:hAnsi="Cambria Math"/>
+          <w:b w:val="0"/>
+          <w:i/>
+          <w:color w:val="101828"/>
+          <w:sz w:val="22"/>
+          <w:rFonts w:ascii="Cambria Math" w:hAnsi="Cambria Math" w:eastAsia="Cambria Math"/>
+        </w:rPr>
+        <w:t>[10, 35]</w:t>
+      </w:r>
+      <w:r>
+        <w:rPr>
+          <w:rFonts w:ascii="Times New Roman" w:hAnsi="Times New Roman"/>
+          <w:b w:val="0"/>
+          <w:i w:val="0"/>
+          <w:color w:val="1D2939"/>
+          <w:sz w:val="22"/>
+          <w:rFonts w:ascii="Times New Roman" w:hAnsi="Times New Roman" w:eastAsia="宋体"/>
+        </w:rPr>
+        <w:t>）、丰厚（Generous，</w:t>
+      </w:r>
+      <w:r>
+        <w:rPr>
+          <w:rFonts w:ascii="Cambria Math" w:hAnsi="Cambria Math"/>
+          <w:b w:val="0"/>
+          <w:i/>
+          <w:color w:val="101828"/>
+          <w:sz w:val="22"/>
+          <w:rFonts w:ascii="Cambria Math" w:hAnsi="Cambria Math" w:eastAsia="Cambria Math"/>
+        </w:rPr>
+        <w:t>[25, 50]</w:t>
+      </w:r>
+      <w:r>
+        <w:rPr>
+          <w:rFonts w:ascii="Times New Roman" w:hAnsi="Times New Roman"/>
+          <w:b w:val="0"/>
+          <w:i w:val="0"/>
+          <w:color w:val="1D2939"/>
+          <w:sz w:val="22"/>
+          <w:rFonts w:ascii="Times New Roman" w:hAnsi="Times New Roman" w:eastAsia="宋体"/>
+        </w:rPr>
+        <w:t>）。</w:t>
       </w:r>
     </w:p>
     <w:p>
@@ -3151,7 +4421,40 @@
                 <w:sz w:val="21"/>
                 <w:rFonts w:ascii="Times New Roman" w:hAnsi="Times New Roman" w:eastAsia="黑体"/>
               </w:rPr>
-              <w:t>超期间隔 $\Delta t_{\text{over}}$ \ 买家信誉 $C_{\text{buyer}}$</w:t>
+              <w:t xml:space="preserve">超期间隔 </w:t>
+            </w:r>
+            <w:r>
+              <w:rPr>
+                <w:rFonts w:ascii="Cambria Math" w:hAnsi="Cambria Math"/>
+                <w:b w:val="0"/>
+                <w:i/>
+                <w:color w:val="101828"/>
+                <w:sz w:val="21"/>
+                <w:rFonts w:ascii="Cambria Math" w:hAnsi="Cambria Math" w:eastAsia="Cambria Math"/>
+              </w:rPr>
+              <w:t>Δ t_{over}</w:t>
+            </w:r>
+            <w:r>
+              <w:rPr>
+                <w:rFonts w:ascii="Times New Roman" w:hAnsi="Times New Roman"/>
+                <w:b w:val="0"/>
+                <w:i w:val="0"/>
+                <w:color w:val="101828"/>
+                <w:sz w:val="21"/>
+                <w:rFonts w:ascii="Times New Roman" w:hAnsi="Times New Roman" w:eastAsia="黑体"/>
+              </w:rPr>
+              <w:t xml:space="preserve"> \ 买家信誉 </w:t>
+            </w:r>
+            <w:r>
+              <w:rPr>
+                <w:rFonts w:ascii="Cambria Math" w:hAnsi="Cambria Math"/>
+                <w:b w:val="0"/>
+                <w:i/>
+                <w:color w:val="101828"/>
+                <w:sz w:val="21"/>
+                <w:rFonts w:ascii="Cambria Math" w:hAnsi="Cambria Math" w:eastAsia="Cambria Math"/>
+              </w:rPr>
+              <w:t>C_{buyer}</w:t>
             </w:r>
           </w:p>
         </w:tc>
@@ -3600,7 +4903,7 @@
     </w:tbl>
     <w:p>
       <w:pPr>
-        <w:spacing w:after="120"/>
+        <w:spacing w:after="80"/>
       </w:pPr>
     </w:p>
     <w:p>
@@ -3690,7 +4993,95 @@
           <w:sz w:val="22"/>
           <w:rFonts w:ascii="Times New Roman" w:hAnsi="Times New Roman" w:eastAsia="宋体"/>
         </w:rPr>
-        <w:t>基线正向链推理每轮需全表重复扫描规则库 $\mathcal{R}$，其理论时间复杂度为 $O(I \cdot |\mathcal{R}| \cdot \bar{k})$，其中 $I$ 为扫描迭代轮数，$\bar{k}$ 为前件平均数。随着规则规模扩展至上万条，无关匹配开销急剧恶化。</w:t>
+        <w:t xml:space="preserve">基线正向链推理每轮需全表重复扫描规则库 </w:t>
+      </w:r>
+      <w:r>
+        <w:rPr>
+          <w:rFonts w:ascii="Cambria Math" w:hAnsi="Cambria Math"/>
+          <w:b w:val="0"/>
+          <w:i/>
+          <w:color w:val="101828"/>
+          <w:sz w:val="22"/>
+          <w:rFonts w:ascii="Cambria Math" w:hAnsi="Cambria Math" w:eastAsia="Cambria Math"/>
+        </w:rPr>
+        <w:t>R</w:t>
+      </w:r>
+      <w:r>
+        <w:rPr>
+          <w:rFonts w:ascii="Times New Roman" w:hAnsi="Times New Roman"/>
+          <w:b w:val="0"/>
+          <w:i w:val="0"/>
+          <w:color w:val="1D2939"/>
+          <w:sz w:val="22"/>
+          <w:rFonts w:ascii="Times New Roman" w:hAnsi="Times New Roman" w:eastAsia="宋体"/>
+        </w:rPr>
+        <w:t xml:space="preserve">，其理论时间复杂度为 </w:t>
+      </w:r>
+      <w:r>
+        <w:rPr>
+          <w:rFonts w:ascii="Cambria Math" w:hAnsi="Cambria Math"/>
+          <w:b w:val="0"/>
+          <w:i/>
+          <w:color w:val="101828"/>
+          <w:sz w:val="22"/>
+          <w:rFonts w:ascii="Cambria Math" w:hAnsi="Cambria Math" w:eastAsia="Cambria Math"/>
+        </w:rPr>
+        <w:t>O(I · |R| · bar{k})</w:t>
+      </w:r>
+      <w:r>
+        <w:rPr>
+          <w:rFonts w:ascii="Times New Roman" w:hAnsi="Times New Roman"/>
+          <w:b w:val="0"/>
+          <w:i w:val="0"/>
+          <w:color w:val="1D2939"/>
+          <w:sz w:val="22"/>
+          <w:rFonts w:ascii="Times New Roman" w:hAnsi="Times New Roman" w:eastAsia="宋体"/>
+        </w:rPr>
+        <w:t xml:space="preserve">，其中 </w:t>
+      </w:r>
+      <w:r>
+        <w:rPr>
+          <w:rFonts w:ascii="Cambria Math" w:hAnsi="Cambria Math"/>
+          <w:b w:val="0"/>
+          <w:i/>
+          <w:color w:val="101828"/>
+          <w:sz w:val="22"/>
+          <w:rFonts w:ascii="Cambria Math" w:hAnsi="Cambria Math" w:eastAsia="Cambria Math"/>
+        </w:rPr>
+        <w:t>I</w:t>
+      </w:r>
+      <w:r>
+        <w:rPr>
+          <w:rFonts w:ascii="Times New Roman" w:hAnsi="Times New Roman"/>
+          <w:b w:val="0"/>
+          <w:i w:val="0"/>
+          <w:color w:val="1D2939"/>
+          <w:sz w:val="22"/>
+          <w:rFonts w:ascii="Times New Roman" w:hAnsi="Times New Roman" w:eastAsia="宋体"/>
+        </w:rPr>
+        <w:t xml:space="preserve"> 为扫描迭代轮数，</w:t>
+      </w:r>
+      <w:r>
+        <w:rPr>
+          <w:rFonts w:ascii="Cambria Math" w:hAnsi="Cambria Math"/>
+          <w:b w:val="0"/>
+          <w:i/>
+          <w:color w:val="101828"/>
+          <w:sz w:val="22"/>
+          <w:rFonts w:ascii="Cambria Math" w:hAnsi="Cambria Math" w:eastAsia="Cambria Math"/>
+        </w:rPr>
+        <w:t>bar{k}</w:t>
+      </w:r>
+      <w:r>
+        <w:rPr>
+          <w:rFonts w:ascii="Times New Roman" w:hAnsi="Times New Roman"/>
+          <w:b w:val="0"/>
+          <w:i w:val="0"/>
+          <w:color w:val="1D2939"/>
+          <w:sz w:val="22"/>
+          <w:rFonts w:ascii="Times New Roman" w:hAnsi="Times New Roman" w:eastAsia="宋体"/>
+        </w:rPr>
+        <w:t xml:space="preserve"> 为前件平均数。随着规则规模扩展至上万条，无关匹配开销急剧恶化。</w:t>
       </w:r>
     </w:p>
     <w:p>
@@ -3758,7 +5149,6 @@
       <w:tblPr>
         <w:tblW w:type="auto" w:w="0"/>
         <w:jc w:val="center"/>
-        <w:tblLayout w:type="autofit"/>
         <w:tblLook w:firstColumn="1" w:firstRow="1" w:lastColumn="0" w:lastRow="0" w:noHBand="0" w:noVBand="1" w:val="04A0"/>
       </w:tblPr>
       <w:tblGrid>
@@ -3772,8 +5162,8 @@
             <w:tcMar>
               <w:top w:w="140" w:type="dxa"/>
               <w:bottom w:w="140" w:type="dxa"/>
-              <w:left w:w="200" w:type="dxa"/>
-              <w:right w:w="200" w:type="dxa"/>
+              <w:left w:w="180" w:type="dxa"/>
+              <w:right w:w="180" w:type="dxa"/>
             </w:tcMar>
             <w:tcBorders>
               <w:top w:val="single" w:sz="4" w:space="0" w:color="EAECF0"/>
@@ -3857,7 +5247,7 @@
     </w:tbl>
     <w:p>
       <w:pPr>
-        <w:spacing w:after="120"/>
+        <w:spacing w:after="80"/>
       </w:pPr>
     </w:p>
     <w:p>
@@ -3959,7 +5349,6 @@
       <w:tblPr>
         <w:tblW w:type="auto" w:w="0"/>
         <w:jc w:val="center"/>
-        <w:tblLayout w:type="autofit"/>
         <w:tblLook w:firstColumn="1" w:firstRow="1" w:lastColumn="0" w:lastRow="0" w:noHBand="0" w:noVBand="1" w:val="04A0"/>
       </w:tblPr>
       <w:tblGrid>
@@ -3973,8 +5362,8 @@
             <w:tcMar>
               <w:top w:w="140" w:type="dxa"/>
               <w:bottom w:w="140" w:type="dxa"/>
-              <w:left w:w="200" w:type="dxa"/>
-              <w:right w:w="200" w:type="dxa"/>
+              <w:left w:w="180" w:type="dxa"/>
+              <w:right w:w="180" w:type="dxa"/>
             </w:tcMar>
             <w:tcBorders>
               <w:top w:val="single" w:sz="4" w:space="0" w:color="EAECF0"/>
@@ -4039,7 +5428,7 @@
     </w:tbl>
     <w:p>
       <w:pPr>
-        <w:spacing w:after="120"/>
+        <w:spacing w:after="80"/>
       </w:pPr>
     </w:p>
     <w:p>
@@ -4161,18 +5550,19 @@
     </w:p>
     <w:p>
       <w:pPr>
-        <w:spacing w:before="80" w:after="80"/>
+        <w:spacing w:before="100" w:after="100"/>
         <w:jc w:val="center"/>
       </w:pPr>
       <w:r>
         <w:rPr>
-          <w:rFonts w:ascii="Times New Roman" w:hAnsi="Times New Roman"/>
+          <w:rFonts w:ascii="Cambria Math" w:hAnsi="Cambria Math"/>
           <w:b w:val="0"/>
           <w:i/>
-          <w:sz w:val="22"/>
-          <w:rFonts w:ascii="Times New Roman" w:hAnsi="Times New Roman" w:eastAsia="Times New Roman"/>
-        </w:rPr>
-        <w:t>z^* = \frac{\sum_{k=0}^{N} (z_{\min} + k \cdot \Delta z) \cdot \mu_{\text{agg}}(z_{\min} + k \cdot \Delta z)}{\sum_{k=0}^{N} \mu_{\text{agg}}(z_{\min} + k \cdot \Delta z)}</w:t>
+          <w:color w:val="101828"/>
+          <w:sz w:val="23"/>
+          <w:rFonts w:ascii="Cambria Math" w:hAnsi="Cambria Math" w:eastAsia="Cambria Math"/>
+        </w:rPr>
+        <w:t>z^* = {∑_{k=0}^{N} (z_{min} + k · Δ z) · μ_{agg}(z_{min} + k · Δ z)}{∑_{k=0}^{N} μ_{agg}(z_{min} + k · Δ z)}</w:t>
       </w:r>
     </w:p>
     <w:p>
@@ -4189,7 +5579,73 @@
           <w:sz w:val="22"/>
           <w:rFonts w:ascii="Times New Roman" w:hAnsi="Times New Roman" w:eastAsia="宋体"/>
         </w:rPr>
-        <w:t>离散步长取 $N = 200$，在保证数值精度达到 $10^{-4}$ 的同时，单次求积耗时控制在 $15\ \mu\text{s}$ 以内。</w:t>
+        <w:t xml:space="preserve">离散步长取 </w:t>
+      </w:r>
+      <w:r>
+        <w:rPr>
+          <w:rFonts w:ascii="Cambria Math" w:hAnsi="Cambria Math"/>
+          <w:b w:val="0"/>
+          <w:i/>
+          <w:color w:val="101828"/>
+          <w:sz w:val="22"/>
+          <w:rFonts w:ascii="Cambria Math" w:hAnsi="Cambria Math" w:eastAsia="Cambria Math"/>
+        </w:rPr>
+        <w:t>N = 200</w:t>
+      </w:r>
+      <w:r>
+        <w:rPr>
+          <w:rFonts w:ascii="Times New Roman" w:hAnsi="Times New Roman"/>
+          <w:b w:val="0"/>
+          <w:i w:val="0"/>
+          <w:color w:val="1D2939"/>
+          <w:sz w:val="22"/>
+          <w:rFonts w:ascii="Times New Roman" w:hAnsi="Times New Roman" w:eastAsia="宋体"/>
+        </w:rPr>
+        <w:t xml:space="preserve">，在保证数值精度达到 </w:t>
+      </w:r>
+      <w:r>
+        <w:rPr>
+          <w:rFonts w:ascii="Cambria Math" w:hAnsi="Cambria Math"/>
+          <w:b w:val="0"/>
+          <w:i/>
+          <w:color w:val="101828"/>
+          <w:sz w:val="22"/>
+          <w:rFonts w:ascii="Cambria Math" w:hAnsi="Cambria Math" w:eastAsia="Cambria Math"/>
+        </w:rPr>
+        <w:t>10^{-4}</w:t>
+      </w:r>
+      <w:r>
+        <w:rPr>
+          <w:rFonts w:ascii="Times New Roman" w:hAnsi="Times New Roman"/>
+          <w:b w:val="0"/>
+          <w:i w:val="0"/>
+          <w:color w:val="1D2939"/>
+          <w:sz w:val="22"/>
+          <w:rFonts w:ascii="Times New Roman" w:hAnsi="Times New Roman" w:eastAsia="宋体"/>
+        </w:rPr>
+        <w:t xml:space="preserve"> 的同时，单次求积耗时控制在 </w:t>
+      </w:r>
+      <w:r>
+        <w:rPr>
+          <w:rFonts w:ascii="Cambria Math" w:hAnsi="Cambria Math"/>
+          <w:b w:val="0"/>
+          <w:i/>
+          <w:color w:val="101828"/>
+          <w:sz w:val="22"/>
+          <w:rFonts w:ascii="Cambria Math" w:hAnsi="Cambria Math" w:eastAsia="Cambria Math"/>
+        </w:rPr>
+        <w:t>15 μs</w:t>
+      </w:r>
+      <w:r>
+        <w:rPr>
+          <w:rFonts w:ascii="Times New Roman" w:hAnsi="Times New Roman"/>
+          <w:b w:val="0"/>
+          <w:i w:val="0"/>
+          <w:color w:val="1D2939"/>
+          <w:sz w:val="22"/>
+          <w:rFonts w:ascii="Times New Roman" w:hAnsi="Times New Roman" w:eastAsia="宋体"/>
+        </w:rPr>
+        <w:t xml:space="preserve"> 以内。</w:t>
       </w:r>
     </w:p>
     <w:p>
@@ -4713,7 +6169,51 @@
           <w:sz w:val="22"/>
           <w:rFonts w:ascii="Times New Roman" w:hAnsi="Times New Roman" w:eastAsia="宋体"/>
         </w:rPr>
-        <w:t>为了检验启发式支持集与一票否决优先级对传统正向演绎组合爆炸的抑制效果，构建规则规模从 $N=10$ 扩展到 $N=100$ 的合成知识库，针对同一目标命题记录遍历搜索空间、规则命中数及运行时间。</w:t>
+        <w:t xml:space="preserve">为了检验启发式支持集与一票否决优先级对传统正向演绎组合爆炸的抑制效果，构建规则规模从 </w:t>
+      </w:r>
+      <w:r>
+        <w:rPr>
+          <w:rFonts w:ascii="Cambria Math" w:hAnsi="Cambria Math"/>
+          <w:b w:val="0"/>
+          <w:i/>
+          <w:color w:val="101828"/>
+          <w:sz w:val="22"/>
+          <w:rFonts w:ascii="Cambria Math" w:hAnsi="Cambria Math" w:eastAsia="Cambria Math"/>
+        </w:rPr>
+        <w:t>N=10</w:t>
+      </w:r>
+      <w:r>
+        <w:rPr>
+          <w:rFonts w:ascii="Times New Roman" w:hAnsi="Times New Roman"/>
+          <w:b w:val="0"/>
+          <w:i w:val="0"/>
+          <w:color w:val="1D2939"/>
+          <w:sz w:val="22"/>
+          <w:rFonts w:ascii="Times New Roman" w:hAnsi="Times New Roman" w:eastAsia="宋体"/>
+        </w:rPr>
+        <w:t xml:space="preserve"> 扩展到 </w:t>
+      </w:r>
+      <w:r>
+        <w:rPr>
+          <w:rFonts w:ascii="Cambria Math" w:hAnsi="Cambria Math"/>
+          <w:b w:val="0"/>
+          <w:i/>
+          <w:color w:val="101828"/>
+          <w:sz w:val="22"/>
+          <w:rFonts w:ascii="Cambria Math" w:hAnsi="Cambria Math" w:eastAsia="Cambria Math"/>
+        </w:rPr>
+        <w:t>N=100</w:t>
+      </w:r>
+      <w:r>
+        <w:rPr>
+          <w:rFonts w:ascii="Times New Roman" w:hAnsi="Times New Roman"/>
+          <w:b w:val="0"/>
+          <w:i w:val="0"/>
+          <w:color w:val="1D2939"/>
+          <w:sz w:val="22"/>
+          <w:rFonts w:ascii="Times New Roman" w:hAnsi="Times New Roman" w:eastAsia="宋体"/>
+        </w:rPr>
+        <w:t xml:space="preserve"> 的合成知识库，针对同一目标命题记录遍历搜索空间、规则命中数及运行时间。</w:t>
       </w:r>
     </w:p>
     <w:p>
@@ -4787,7 +6287,18 @@
                 <w:sz w:val="21"/>
                 <w:rFonts w:ascii="Times New Roman" w:hAnsi="Times New Roman" w:eastAsia="黑体"/>
               </w:rPr>
-              <w:t>规则库规模 $N$</w:t>
+              <w:t xml:space="preserve">规则库规模 </w:t>
+            </w:r>
+            <w:r>
+              <w:rPr>
+                <w:rFonts w:ascii="Cambria Math" w:hAnsi="Cambria Math"/>
+                <w:b w:val="0"/>
+                <w:i/>
+                <w:color w:val="101828"/>
+                <w:sz w:val="21"/>
+                <w:rFonts w:ascii="Cambria Math" w:hAnsi="Cambria Math" w:eastAsia="Cambria Math"/>
+              </w:rPr>
+              <w:t>N</w:t>
             </w:r>
           </w:p>
         </w:tc>
@@ -4919,7 +6430,29 @@
                 <w:sz w:val="21"/>
                 <w:rFonts w:ascii="Times New Roman" w:hAnsi="Times New Roman" w:eastAsia="黑体"/>
               </w:rPr>
-              <w:t>基线耗时 ($\mu\text{s}$)</w:t>
+              <w:t>基线耗时 (</w:t>
+            </w:r>
+            <w:r>
+              <w:rPr>
+                <w:rFonts w:ascii="Cambria Math" w:hAnsi="Cambria Math"/>
+                <w:b w:val="0"/>
+                <w:i/>
+                <w:color w:val="101828"/>
+                <w:sz w:val="21"/>
+                <w:rFonts w:ascii="Cambria Math" w:hAnsi="Cambria Math" w:eastAsia="Cambria Math"/>
+              </w:rPr>
+              <w:t>μs</w:t>
+            </w:r>
+            <w:r>
+              <w:rPr>
+                <w:rFonts w:ascii="Times New Roman" w:hAnsi="Times New Roman"/>
+                <w:b w:val="0"/>
+                <w:i w:val="0"/>
+                <w:color w:val="101828"/>
+                <w:sz w:val="21"/>
+                <w:rFonts w:ascii="Times New Roman" w:hAnsi="Times New Roman" w:eastAsia="黑体"/>
+              </w:rPr>
+              <w:t>)</w:t>
             </w:r>
           </w:p>
         </w:tc>
@@ -4952,7 +6485,29 @@
                 <w:sz w:val="21"/>
                 <w:rFonts w:ascii="Times New Roman" w:hAnsi="Times New Roman" w:eastAsia="黑体"/>
               </w:rPr>
-              <w:t>剪枝优化耗时 ($\mu\text{s}$)</w:t>
+              <w:t>剪枝优化耗时 (</w:t>
+            </w:r>
+            <w:r>
+              <w:rPr>
+                <w:rFonts w:ascii="Cambria Math" w:hAnsi="Cambria Math"/>
+                <w:b w:val="0"/>
+                <w:i/>
+                <w:color w:val="101828"/>
+                <w:sz w:val="21"/>
+                <w:rFonts w:ascii="Cambria Math" w:hAnsi="Cambria Math" w:eastAsia="Cambria Math"/>
+              </w:rPr>
+              <w:t>μs</w:t>
+            </w:r>
+            <w:r>
+              <w:rPr>
+                <w:rFonts w:ascii="Times New Roman" w:hAnsi="Times New Roman"/>
+                <w:b w:val="0"/>
+                <w:i w:val="0"/>
+                <w:color w:val="101828"/>
+                <w:sz w:val="21"/>
+                <w:rFonts w:ascii="Times New Roman" w:hAnsi="Times New Roman" w:eastAsia="黑体"/>
+              </w:rPr>
+              <w:t>)</w:t>
             </w:r>
           </w:p>
         </w:tc>
@@ -5983,18 +7538,19 @@
     </w:tbl>
     <w:p>
       <w:pPr>
-        <w:spacing w:after="120"/>
+        <w:spacing w:after="80"/>
       </w:pPr>
     </w:p>
     <w:p>
       <w:pPr>
-        <w:spacing w:before="160" w:after="40"/>
+        <w:keepNext/>
+        <w:spacing w:before="200" w:after="40"/>
         <w:jc w:val="center"/>
       </w:pPr>
       <w:r>
         <w:drawing>
           <wp:inline xmlns:a="http://schemas.openxmlformats.org/drawingml/2006/main" xmlns:pic="http://schemas.openxmlformats.org/drawingml/2006/picture">
-            <wp:extent cx="5303520" cy="2159563"/>
+            <wp:extent cx="5212080" cy="2122329"/>
             <wp:docPr id="2" name="Picture 2"/>
             <wp:cNvGraphicFramePr>
               <a:graphicFrameLocks noChangeAspect="1"/>
@@ -6015,7 +7571,7 @@
                   <pic:spPr>
                     <a:xfrm>
                       <a:off x="0" y="0"/>
-                      <a:ext cx="5303520" cy="2159563"/>
+                      <a:ext cx="5212080" cy="2122329"/>
                     </a:xfrm>
                     <a:prstGeom prst="rect"/>
                   </pic:spPr>
@@ -6028,8 +7584,7 @@
     </w:p>
     <w:p>
       <w:pPr>
-        <w:keepNext w:val="0"/>
-        <w:spacing w:before="40" w:after="160"/>
+        <w:spacing w:before="40" w:after="200"/>
         <w:jc w:val="center"/>
       </w:pPr>
       <w:r>
@@ -6086,7 +7641,29 @@
           <w:sz w:val="22"/>
           <w:rFonts w:ascii="Times New Roman" w:hAnsi="Times New Roman" w:eastAsia="宋体"/>
         </w:rPr>
-        <w:t xml:space="preserve">如图 2 所示，基线算法的遍历搜索步数随着规则规模呈线性阶跃增长（每轮必全表重复扫描），当 $N=100$ 时累积扫描达 200 次；而引入一票否决优先级与支持集谓词索引后，推理机仅精准激活具有因果关联的 11 条依赖边，搜索空间压缩率高达 </w:t>
+        <w:t xml:space="preserve">如图 2 所示，基线算法的遍历搜索步数随着规则规模呈线性阶跃增长（每轮必全表重复扫描），当 </w:t>
+      </w:r>
+      <w:r>
+        <w:rPr>
+          <w:rFonts w:ascii="Cambria Math" w:hAnsi="Cambria Math"/>
+          <w:b w:val="0"/>
+          <w:i/>
+          <w:color w:val="101828"/>
+          <w:sz w:val="22"/>
+          <w:rFonts w:ascii="Cambria Math" w:hAnsi="Cambria Math" w:eastAsia="Cambria Math"/>
+        </w:rPr>
+        <w:t>N=100</w:t>
+      </w:r>
+      <w:r>
+        <w:rPr>
+          <w:rFonts w:ascii="Times New Roman" w:hAnsi="Times New Roman"/>
+          <w:b w:val="0"/>
+          <w:i w:val="0"/>
+          <w:color w:val="1D2939"/>
+          <w:sz w:val="22"/>
+          <w:rFonts w:ascii="Times New Roman" w:hAnsi="Times New Roman" w:eastAsia="宋体"/>
+        </w:rPr>
+        <w:t xml:space="preserve"> 时累积扫描达 200 次；而引入一票否决优先级与支持集谓词索引后，推理机仅精准激活具有因果关联的 11 条依赖边，搜索空间压缩率高达 </w:t>
       </w:r>
       <w:r>
         <w:rPr>
@@ -6108,7 +7685,29 @@
           <w:sz w:val="22"/>
           <w:rFonts w:ascii="Times New Roman" w:hAnsi="Times New Roman" w:eastAsia="宋体"/>
         </w:rPr>
-        <w:t xml:space="preserve">，运行耗时下降至 $20.0\ \mu\text{s}$，获得 </w:t>
+        <w:t xml:space="preserve">，运行耗时下降至 </w:t>
+      </w:r>
+      <w:r>
+        <w:rPr>
+          <w:rFonts w:ascii="Cambria Math" w:hAnsi="Cambria Math"/>
+          <w:b w:val="0"/>
+          <w:i/>
+          <w:color w:val="101828"/>
+          <w:sz w:val="22"/>
+          <w:rFonts w:ascii="Cambria Math" w:hAnsi="Cambria Math" w:eastAsia="Cambria Math"/>
+        </w:rPr>
+        <w:t>20.0 μs</w:t>
+      </w:r>
+      <w:r>
+        <w:rPr>
+          <w:rFonts w:ascii="Times New Roman" w:hAnsi="Times New Roman"/>
+          <w:b w:val="0"/>
+          <w:i w:val="0"/>
+          <w:color w:val="1D2939"/>
+          <w:sz w:val="22"/>
+          <w:rFonts w:ascii="Times New Roman" w:hAnsi="Times New Roman" w:eastAsia="宋体"/>
+        </w:rPr>
+        <w:t xml:space="preserve">，获得 </w:t>
       </w:r>
       <w:r>
         <w:rPr>
@@ -6164,7 +7763,95 @@
           <w:sz w:val="22"/>
           <w:rFonts w:ascii="Times New Roman" w:hAnsi="Times New Roman" w:eastAsia="宋体"/>
         </w:rPr>
-        <w:t>构建 Zadeh 极端冲突实验：在识别框架 $\Theta = \{B(\text{买家}), S(\text{商家}), L(\text{物流})\}$ 下，传感器断言物流责任 $m_1(L) = 0.9999$，视觉质检断言商家责任 $m_2(S) = 0.9999$，两者对立冲突因子高达 $K = 0.9999$。对比经典 Dempster 正交和与 Murphy 加权平均修正融合结果。</w:t>
+        <w:t xml:space="preserve">构建 Zadeh 极端冲突实验：在识别框架 </w:t>
+      </w:r>
+      <w:r>
+        <w:rPr>
+          <w:rFonts w:ascii="Cambria Math" w:hAnsi="Cambria Math"/>
+          <w:b w:val="0"/>
+          <w:i/>
+          <w:color w:val="101828"/>
+          <w:sz w:val="22"/>
+          <w:rFonts w:ascii="Cambria Math" w:hAnsi="Cambria Math" w:eastAsia="Cambria Math"/>
+        </w:rPr>
+        <w:t>Θ = {B(买家), S(商家), L(物流)}</w:t>
+      </w:r>
+      <w:r>
+        <w:rPr>
+          <w:rFonts w:ascii="Times New Roman" w:hAnsi="Times New Roman"/>
+          <w:b w:val="0"/>
+          <w:i w:val="0"/>
+          <w:color w:val="1D2939"/>
+          <w:sz w:val="22"/>
+          <w:rFonts w:ascii="Times New Roman" w:hAnsi="Times New Roman" w:eastAsia="宋体"/>
+        </w:rPr>
+        <w:t xml:space="preserve"> 下，传感器断言物流责任 </w:t>
+      </w:r>
+      <w:r>
+        <w:rPr>
+          <w:rFonts w:ascii="Cambria Math" w:hAnsi="Cambria Math"/>
+          <w:b w:val="0"/>
+          <w:i/>
+          <w:color w:val="101828"/>
+          <w:sz w:val="22"/>
+          <w:rFonts w:ascii="Cambria Math" w:hAnsi="Cambria Math" w:eastAsia="Cambria Math"/>
+        </w:rPr>
+        <w:t>m_1(L) = 0.9999</w:t>
+      </w:r>
+      <w:r>
+        <w:rPr>
+          <w:rFonts w:ascii="Times New Roman" w:hAnsi="Times New Roman"/>
+          <w:b w:val="0"/>
+          <w:i w:val="0"/>
+          <w:color w:val="1D2939"/>
+          <w:sz w:val="22"/>
+          <w:rFonts w:ascii="Times New Roman" w:hAnsi="Times New Roman" w:eastAsia="宋体"/>
+        </w:rPr>
+        <w:t xml:space="preserve">，视觉质检断言商家责任 </w:t>
+      </w:r>
+      <w:r>
+        <w:rPr>
+          <w:rFonts w:ascii="Cambria Math" w:hAnsi="Cambria Math"/>
+          <w:b w:val="0"/>
+          <w:i/>
+          <w:color w:val="101828"/>
+          <w:sz w:val="22"/>
+          <w:rFonts w:ascii="Cambria Math" w:hAnsi="Cambria Math" w:eastAsia="Cambria Math"/>
+        </w:rPr>
+        <w:t>m_2(S) = 0.9999</w:t>
+      </w:r>
+      <w:r>
+        <w:rPr>
+          <w:rFonts w:ascii="Times New Roman" w:hAnsi="Times New Roman"/>
+          <w:b w:val="0"/>
+          <w:i w:val="0"/>
+          <w:color w:val="1D2939"/>
+          <w:sz w:val="22"/>
+          <w:rFonts w:ascii="Times New Roman" w:hAnsi="Times New Roman" w:eastAsia="宋体"/>
+        </w:rPr>
+        <w:t xml:space="preserve">，两者对立冲突因子高达 </w:t>
+      </w:r>
+      <w:r>
+        <w:rPr>
+          <w:rFonts w:ascii="Cambria Math" w:hAnsi="Cambria Math"/>
+          <w:b w:val="0"/>
+          <w:i/>
+          <w:color w:val="101828"/>
+          <w:sz w:val="22"/>
+          <w:rFonts w:ascii="Cambria Math" w:hAnsi="Cambria Math" w:eastAsia="Cambria Math"/>
+        </w:rPr>
+        <w:t>K = 0.9999</w:t>
+      </w:r>
+      <w:r>
+        <w:rPr>
+          <w:rFonts w:ascii="Times New Roman" w:hAnsi="Times New Roman"/>
+          <w:b w:val="0"/>
+          <w:i w:val="0"/>
+          <w:color w:val="1D2939"/>
+          <w:sz w:val="22"/>
+          <w:rFonts w:ascii="Times New Roman" w:hAnsi="Times New Roman" w:eastAsia="宋体"/>
+        </w:rPr>
+        <w:t>。对比经典 Dempster 正交和与 Murphy 加权平均修正融合结果。</w:t>
       </w:r>
     </w:p>
     <w:p>
@@ -6269,7 +7956,18 @@
                 <w:sz w:val="21"/>
                 <w:rFonts w:ascii="Times New Roman" w:hAnsi="Times New Roman" w:eastAsia="黑体"/>
               </w:rPr>
-              <w:t>证据 1 传感器质检 $m_1$</w:t>
+              <w:t xml:space="preserve">证据 1 传感器质检 </w:t>
+            </w:r>
+            <w:r>
+              <w:rPr>
+                <w:rFonts w:ascii="Cambria Math" w:hAnsi="Cambria Math"/>
+                <w:b w:val="0"/>
+                <w:i/>
+                <w:color w:val="101828"/>
+                <w:sz w:val="21"/>
+                <w:rFonts w:ascii="Cambria Math" w:hAnsi="Cambria Math" w:eastAsia="Cambria Math"/>
+              </w:rPr>
+              <w:t>m_1</w:t>
             </w:r>
           </w:p>
         </w:tc>
@@ -6302,7 +8000,18 @@
                 <w:sz w:val="21"/>
                 <w:rFonts w:ascii="Times New Roman" w:hAnsi="Times New Roman" w:eastAsia="黑体"/>
               </w:rPr>
-              <w:t>证据 2 视觉图像质检 $m_2$</w:t>
+              <w:t xml:space="preserve">证据 2 视觉图像质检 </w:t>
+            </w:r>
+            <w:r>
+              <w:rPr>
+                <w:rFonts w:ascii="Cambria Math" w:hAnsi="Cambria Math"/>
+                <w:b w:val="0"/>
+                <w:i/>
+                <w:color w:val="101828"/>
+                <w:sz w:val="21"/>
+                <w:rFonts w:ascii="Cambria Math" w:hAnsi="Cambria Math" w:eastAsia="Cambria Math"/>
+              </w:rPr>
+              <w:t>m_2</w:t>
             </w:r>
           </w:p>
         </w:tc>
@@ -6944,18 +8653,19 @@
     </w:tbl>
     <w:p>
       <w:pPr>
-        <w:spacing w:after="120"/>
+        <w:spacing w:after="80"/>
       </w:pPr>
     </w:p>
     <w:p>
       <w:pPr>
-        <w:spacing w:before="160" w:after="40"/>
+        <w:keepNext/>
+        <w:spacing w:before="200" w:after="40"/>
         <w:jc w:val="center"/>
       </w:pPr>
       <w:r>
         <w:drawing>
           <wp:inline xmlns:a="http://schemas.openxmlformats.org/drawingml/2006/main" xmlns:pic="http://schemas.openxmlformats.org/drawingml/2006/picture">
-            <wp:extent cx="5303520" cy="2159563"/>
+            <wp:extent cx="5212080" cy="2122329"/>
             <wp:docPr id="3" name="Picture 3"/>
             <wp:cNvGraphicFramePr>
               <a:graphicFrameLocks noChangeAspect="1"/>
@@ -6976,7 +8686,7 @@
                   <pic:spPr>
                     <a:xfrm>
                       <a:off x="0" y="0"/>
-                      <a:ext cx="5303520" cy="2159563"/>
+                      <a:ext cx="5212080" cy="2122329"/>
                     </a:xfrm>
                     <a:prstGeom prst="rect"/>
                   </pic:spPr>
@@ -6989,8 +8699,7 @@
     </w:p>
     <w:p>
       <w:pPr>
-        <w:keepNext w:val="0"/>
-        <w:spacing w:before="40" w:after="160"/>
+        <w:spacing w:before="40" w:after="200"/>
         <w:jc w:val="center"/>
       </w:pPr>
       <w:r>
@@ -7047,7 +8756,51 @@
           <w:sz w:val="22"/>
           <w:rFonts w:ascii="Times New Roman" w:hAnsi="Times New Roman" w:eastAsia="宋体"/>
         </w:rPr>
-        <w:t xml:space="preserve">如图 3 与表 3 所示，经典 Dempster 规则由于非空交集极小（仅 $0.00005 \times 0.00005$），被归一化分母 $1-K = 0.0001$ 恶性放大，竟然以 </w:t>
+        <w:t xml:space="preserve">如图 3 与表 3 所示，经典 Dempster 规则由于非空交集极小（仅 </w:t>
+      </w:r>
+      <w:r>
+        <w:rPr>
+          <w:rFonts w:ascii="Cambria Math" w:hAnsi="Cambria Math"/>
+          <w:b w:val="0"/>
+          <w:i/>
+          <w:color w:val="101828"/>
+          <w:sz w:val="22"/>
+          <w:rFonts w:ascii="Cambria Math" w:hAnsi="Cambria Math" w:eastAsia="Cambria Math"/>
+        </w:rPr>
+        <w:t>0.00005 × 0.00005</w:t>
+      </w:r>
+      <w:r>
+        <w:rPr>
+          <w:rFonts w:ascii="Times New Roman" w:hAnsi="Times New Roman"/>
+          <w:b w:val="0"/>
+          <w:i w:val="0"/>
+          <w:color w:val="1D2939"/>
+          <w:sz w:val="22"/>
+          <w:rFonts w:ascii="Times New Roman" w:hAnsi="Times New Roman" w:eastAsia="宋体"/>
+        </w:rPr>
+        <w:t xml:space="preserve">），被归一化分母 </w:t>
+      </w:r>
+      <w:r>
+        <w:rPr>
+          <w:rFonts w:ascii="Cambria Math" w:hAnsi="Cambria Math"/>
+          <w:b w:val="0"/>
+          <w:i/>
+          <w:color w:val="101828"/>
+          <w:sz w:val="22"/>
+          <w:rFonts w:ascii="Cambria Math" w:hAnsi="Cambria Math" w:eastAsia="Cambria Math"/>
+        </w:rPr>
+        <w:t>1-K = 0.0001</w:t>
+      </w:r>
+      <w:r>
+        <w:rPr>
+          <w:rFonts w:ascii="Times New Roman" w:hAnsi="Times New Roman"/>
+          <w:b w:val="0"/>
+          <w:i w:val="0"/>
+          <w:color w:val="1D2939"/>
+          <w:sz w:val="22"/>
+          <w:rFonts w:ascii="Times New Roman" w:hAnsi="Times New Roman" w:eastAsia="宋体"/>
+        </w:rPr>
+        <w:t xml:space="preserve"> 恶性放大，竟然以 </w:t>
       </w:r>
       <w:r>
         <w:rPr>
@@ -8112,18 +9865,19 @@
     </w:tbl>
     <w:p>
       <w:pPr>
-        <w:spacing w:after="120"/>
+        <w:spacing w:after="80"/>
       </w:pPr>
     </w:p>
     <w:p>
       <w:pPr>
-        <w:spacing w:before="160" w:after="40"/>
+        <w:keepNext/>
+        <w:spacing w:before="200" w:after="40"/>
         <w:jc w:val="center"/>
       </w:pPr>
       <w:r>
         <w:drawing>
           <wp:inline xmlns:a="http://schemas.openxmlformats.org/drawingml/2006/main" xmlns:pic="http://schemas.openxmlformats.org/drawingml/2006/picture">
-            <wp:extent cx="5303520" cy="2196156"/>
+            <wp:extent cx="5212080" cy="2158291"/>
             <wp:docPr id="4" name="Picture 4"/>
             <wp:cNvGraphicFramePr>
               <a:graphicFrameLocks noChangeAspect="1"/>
@@ -8144,7 +9898,7 @@
                   <pic:spPr>
                     <a:xfrm>
                       <a:off x="0" y="0"/>
-                      <a:ext cx="5303520" cy="2196156"/>
+                      <a:ext cx="5212080" cy="2158291"/>
                     </a:xfrm>
                     <a:prstGeom prst="rect"/>
                   </pic:spPr>
@@ -8157,8 +9911,7 @@
     </w:p>
     <w:p>
       <w:pPr>
-        <w:keepNext w:val="0"/>
-        <w:spacing w:before="40" w:after="160"/>
+        <w:spacing w:before="40" w:after="200"/>
         <w:jc w:val="center"/>
       </w:pPr>
       <w:r>
@@ -8354,18 +10107,19 @@
     </w:p>
     <w:p>
       <w:pPr>
-        <w:spacing w:before="80" w:after="80"/>
+        <w:spacing w:before="100" w:after="100"/>
         <w:jc w:val="center"/>
       </w:pPr>
       <w:r>
         <w:rPr>
-          <w:rFonts w:ascii="Times New Roman" w:hAnsi="Times New Roman"/>
+          <w:rFonts w:ascii="Cambria Math" w:hAnsi="Cambria Math"/>
           <w:b w:val="0"/>
           <w:i/>
-          <w:sz w:val="22"/>
-          <w:rFonts w:ascii="Times New Roman" w:hAnsi="Times New Roman" w:eastAsia="Times New Roman"/>
-        </w:rPr>
-        <w:t>\text{agent\_status} \to \text{decision\_meta} \to \text{ui\_cards} \to \text{text\_delta (流式打字)} \to \text{followup\_pills} \to \text{done}</w:t>
+          <w:color w:val="101828"/>
+          <w:sz w:val="23"/>
+          <w:rFonts w:ascii="Cambria Math" w:hAnsi="Cambria Math" w:eastAsia="Cambria Math"/>
+        </w:rPr>
+        <w:t>agent_status to decision_meta to ui_cards to text_delta (流式打字) to followup_pills to done</w:t>
       </w:r>
     </w:p>
     <w:p>
@@ -8633,7 +10387,29 @@
           <w:sz w:val="22"/>
           <w:rFonts w:ascii="Times New Roman" w:hAnsi="Times New Roman" w:eastAsia="宋体"/>
         </w:rPr>
-        <w:t>针对电商履约中买家、卖家、物流三方证据高度对立冲突的现实难题，首次将 D-S 证据理论引入售后责任判定。针对经典 Dempster 正交规则在 $K \to 1$ 时的“Zadeh 悖论”严重误判缺陷，工程化落地 Murphy 加权平均修正融合算法，在极端冲突测试下将无辜买家的误判率从 100% 纠正至 0.02%，具备扎实的科研探索与数学严谨性。</w:t>
+        <w:t xml:space="preserve">针对电商履约中买家、卖家、物流三方证据高度对立冲突的现实难题，首次将 D-S 证据理论引入售后责任判定。针对经典 Dempster 正交规则在 </w:t>
+      </w:r>
+      <w:r>
+        <w:rPr>
+          <w:rFonts w:ascii="Cambria Math" w:hAnsi="Cambria Math"/>
+          <w:b w:val="0"/>
+          <w:i/>
+          <w:color w:val="101828"/>
+          <w:sz w:val="22"/>
+          <w:rFonts w:ascii="Cambria Math" w:hAnsi="Cambria Math" w:eastAsia="Cambria Math"/>
+        </w:rPr>
+        <w:t>K to 1</w:t>
+      </w:r>
+      <w:r>
+        <w:rPr>
+          <w:rFonts w:ascii="Times New Roman" w:hAnsi="Times New Roman"/>
+          <w:b w:val="0"/>
+          <w:i w:val="0"/>
+          <w:color w:val="1D2939"/>
+          <w:sz w:val="22"/>
+          <w:rFonts w:ascii="Times New Roman" w:hAnsi="Times New Roman" w:eastAsia="宋体"/>
+        </w:rPr>
+        <w:t xml:space="preserve"> 时的“Zadeh 悖论”严重误判缺陷，工程化落地 Murphy 加权平均修正融合算法，在极端冲突测试下将无辜买家的误判率从 100% 纠正至 0.02%，具备扎实的科研探索与数学严谨性。</w:t>
       </w:r>
     </w:p>
     <w:p>

</xml_diff>